<commit_message>
Update to Game Report
>Added figures/designs to report
>MoScoW analysis
>Basic Story / Player Story/ General
</commit_message>
<xml_diff>
--- a/GameReport.docx
+++ b/GameReport.docx
@@ -807,7 +807,7 @@
                 <w:sz w:val="22"/>
                 <w:szCs w:val="22"/>
               </w:rPr>
-              <w:t xml:space="preserve">Different weapon options </w:t>
+              <w:t>Sound/particle system</w:t>
             </w:r>
           </w:p>
         </w:tc>
@@ -851,7 +851,15 @@
                 <w:sz w:val="22"/>
                 <w:szCs w:val="22"/>
               </w:rPr>
-              <w:t xml:space="preserve">Self-made assets </w:t>
+              <w:t>Online multiplayer</w:t>
+            </w:r>
+            <w:r>
+              <w:rPr>
+                <w:rFonts w:ascii="Arial" w:hAnsi="Arial" w:cs="Arial"/>
+                <w:sz w:val="22"/>
+                <w:szCs w:val="22"/>
+              </w:rPr>
+              <w:t xml:space="preserve"> </w:t>
             </w:r>
           </w:p>
         </w:tc>
@@ -919,7 +927,7 @@
                 <w:sz w:val="22"/>
                 <w:szCs w:val="22"/>
               </w:rPr>
-              <w:t>Sound/particle effects</w:t>
+              <w:t>Different weapon options</w:t>
             </w:r>
           </w:p>
         </w:tc>
@@ -1059,6 +1067,317 @@
     </w:p>
     <w:p>
       <w:pPr>
+        <w:pStyle w:val="Heading2"/>
+      </w:pPr>
+      <w:r>
+        <w:t>2.</w:t>
+      </w:r>
+      <w:r>
+        <w:t xml:space="preserve">1 </w:t>
+      </w:r>
+      <w:r>
+        <w:t xml:space="preserve">Pixel Dungeon (2012),  Character Selection </w:t>
+      </w:r>
+    </w:p>
+    <w:p>
+      <w:r>
+        <w:rPr>
+          <w:noProof/>
+        </w:rPr>
+        <w:drawing>
+          <wp:inline distT="0" distB="0" distL="0" distR="0" wp14:anchorId="2B5D7DC5" wp14:editId="3D932406">
+            <wp:extent cx="1332854" cy="2369850"/>
+            <wp:effectExtent l="0" t="0" r="1270" b="0"/>
+            <wp:docPr id="1847532206" name="Picture 4" descr="Shattered Pixel Dungeon - Android Apps on Google Play"/>
+            <wp:cNvGraphicFramePr>
+              <a:graphicFrameLocks xmlns:a="http://schemas.openxmlformats.org/drawingml/2006/main" noChangeAspect="1"/>
+            </wp:cNvGraphicFramePr>
+            <a:graphic xmlns:a="http://schemas.openxmlformats.org/drawingml/2006/main">
+              <a:graphicData uri="http://schemas.openxmlformats.org/drawingml/2006/picture">
+                <pic:pic xmlns:pic="http://schemas.openxmlformats.org/drawingml/2006/picture">
+                  <pic:nvPicPr>
+                    <pic:cNvPr id="0" name="Picture 15" descr="Shattered Pixel Dungeon - Android Apps on Google Play"/>
+                    <pic:cNvPicPr>
+                      <a:picLocks noChangeAspect="1" noChangeArrowheads="1"/>
+                    </pic:cNvPicPr>
+                  </pic:nvPicPr>
+                  <pic:blipFill>
+                    <a:blip r:embed="rId5" cstate="print">
+                      <a:extLst>
+                        <a:ext uri="{28A0092B-C50C-407E-A947-70E740481C1C}">
+                          <a14:useLocalDpi xmlns:a14="http://schemas.microsoft.com/office/drawing/2010/main" val="0"/>
+                        </a:ext>
+                      </a:extLst>
+                    </a:blip>
+                    <a:srcRect/>
+                    <a:stretch>
+                      <a:fillRect/>
+                    </a:stretch>
+                  </pic:blipFill>
+                  <pic:spPr bwMode="auto">
+                    <a:xfrm>
+                      <a:off x="0" y="0"/>
+                      <a:ext cx="1343824" cy="2389355"/>
+                    </a:xfrm>
+                    <a:prstGeom prst="rect">
+                      <a:avLst/>
+                    </a:prstGeom>
+                    <a:noFill/>
+                    <a:ln>
+                      <a:noFill/>
+                    </a:ln>
+                  </pic:spPr>
+                </pic:pic>
+              </a:graphicData>
+            </a:graphic>
+          </wp:inline>
+        </w:drawing>
+      </w:r>
+    </w:p>
+    <w:p/>
+    <w:p>
+      <w:pPr>
+        <w:pStyle w:val="Heading2"/>
+      </w:pPr>
+      <w:r>
+        <w:lastRenderedPageBreak/>
+        <w:t xml:space="preserve">2.2 </w:t>
+      </w:r>
+      <w:r>
+        <w:t xml:space="preserve">Diep.io (2016), </w:t>
+      </w:r>
+      <w:r>
+        <w:t xml:space="preserve">Upgrades Skills </w:t>
+      </w:r>
+    </w:p>
+    <w:p>
+      <w:r>
+        <w:t xml:space="preserve">Like most games in survival upgrades are an important aspect to progression and survival of the player. </w:t>
+      </w:r>
+      <w:r>
+        <w:t xml:space="preserve">Players must obtain exp points from defeating objects each level increase giving upgrade the points the player must use to increase their power, as the player increases in level these are harder to obtain. </w:t>
+      </w:r>
+    </w:p>
+    <w:p>
+      <w:pPr>
+        <w:pStyle w:val="Heading2"/>
+      </w:pPr>
+      <w:r>
+        <w:rPr>
+          <w:noProof/>
+        </w:rPr>
+        <w:drawing>
+          <wp:inline distT="0" distB="0" distL="0" distR="0" wp14:anchorId="565419AE" wp14:editId="4217AA2E">
+            <wp:extent cx="3429000" cy="2228850"/>
+            <wp:effectExtent l="0" t="0" r="0" b="0"/>
+            <wp:docPr id="2013182064" name="Picture 8"/>
+            <wp:cNvGraphicFramePr>
+              <a:graphicFrameLocks xmlns:a="http://schemas.openxmlformats.org/drawingml/2006/main" noChangeAspect="1"/>
+            </wp:cNvGraphicFramePr>
+            <a:graphic xmlns:a="http://schemas.openxmlformats.org/drawingml/2006/main">
+              <a:graphicData uri="http://schemas.openxmlformats.org/drawingml/2006/picture">
+                <pic:pic xmlns:pic="http://schemas.openxmlformats.org/drawingml/2006/picture">
+                  <pic:nvPicPr>
+                    <pic:cNvPr id="0" name="Picture 3"/>
+                    <pic:cNvPicPr>
+                      <a:picLocks noChangeAspect="1" noChangeArrowheads="1"/>
+                    </pic:cNvPicPr>
+                  </pic:nvPicPr>
+                  <pic:blipFill>
+                    <a:blip r:embed="rId6">
+                      <a:extLst>
+                        <a:ext uri="{28A0092B-C50C-407E-A947-70E740481C1C}">
+                          <a14:useLocalDpi xmlns:a14="http://schemas.microsoft.com/office/drawing/2010/main" val="0"/>
+                        </a:ext>
+                      </a:extLst>
+                    </a:blip>
+                    <a:srcRect/>
+                    <a:stretch>
+                      <a:fillRect/>
+                    </a:stretch>
+                  </pic:blipFill>
+                  <pic:spPr bwMode="auto">
+                    <a:xfrm>
+                      <a:off x="0" y="0"/>
+                      <a:ext cx="3429000" cy="2228850"/>
+                    </a:xfrm>
+                    <a:prstGeom prst="rect">
+                      <a:avLst/>
+                    </a:prstGeom>
+                    <a:noFill/>
+                  </pic:spPr>
+                </pic:pic>
+              </a:graphicData>
+            </a:graphic>
+          </wp:inline>
+        </w:drawing>
+      </w:r>
+    </w:p>
+    <w:p>
+      <w:pPr>
+        <w:pStyle w:val="Heading2"/>
+      </w:pPr>
+      <w:r>
+        <w:t xml:space="preserve">2.3 </w:t>
+      </w:r>
+      <w:r>
+        <w:t xml:space="preserve">Hollow Knight (2017) </w:t>
+      </w:r>
+      <w:r>
+        <w:t xml:space="preserve">Upgrade Abilities </w:t>
+      </w:r>
+    </w:p>
+    <w:p>
+      <w:r>
+        <w:t>The innovation from abilities comes from Hollow Knights unique approach to aid player the player in defeating enemies and thus improve survival, this only being unlocked at certain stages of the story as well as requiring the player to careful use of their stamina which these abilities require</w:t>
+      </w:r>
+      <w:r>
+        <w:t xml:space="preserve"> usage </w:t>
+      </w:r>
+      <w:proofErr w:type="spellStart"/>
+      <w:r>
+        <w:t>of</w:t>
+      </w:r>
+      <w:r>
+        <w:t>s</w:t>
+      </w:r>
+      <w:proofErr w:type="spellEnd"/>
+      <w:r>
+        <w:t xml:space="preserve">. </w:t>
+      </w:r>
+    </w:p>
+    <w:p>
+      <w:r>
+        <w:rPr>
+          <w:noProof/>
+        </w:rPr>
+        <w:drawing>
+          <wp:inline distT="0" distB="0" distL="0" distR="0" wp14:anchorId="06E82488" wp14:editId="47B5860C">
+            <wp:extent cx="4383158" cy="2191579"/>
+            <wp:effectExtent l="0" t="0" r="0" b="0"/>
+            <wp:docPr id="1017384716" name="Picture 3" descr="Hollow Knight: All Abilities Ranked"/>
+            <wp:cNvGraphicFramePr>
+              <a:graphicFrameLocks xmlns:a="http://schemas.openxmlformats.org/drawingml/2006/main" noChangeAspect="1"/>
+            </wp:cNvGraphicFramePr>
+            <a:graphic xmlns:a="http://schemas.openxmlformats.org/drawingml/2006/main">
+              <a:graphicData uri="http://schemas.openxmlformats.org/drawingml/2006/picture">
+                <pic:pic xmlns:pic="http://schemas.openxmlformats.org/drawingml/2006/picture">
+                  <pic:nvPicPr>
+                    <pic:cNvPr id="0" name="Picture 13" descr="Hollow Knight: All Abilities Ranked"/>
+                    <pic:cNvPicPr>
+                      <a:picLocks noChangeAspect="1" noChangeArrowheads="1"/>
+                    </pic:cNvPicPr>
+                  </pic:nvPicPr>
+                  <pic:blipFill>
+                    <a:blip r:embed="rId7" cstate="print">
+                      <a:extLst>
+                        <a:ext uri="{28A0092B-C50C-407E-A947-70E740481C1C}">
+                          <a14:useLocalDpi xmlns:a14="http://schemas.microsoft.com/office/drawing/2010/main" val="0"/>
+                        </a:ext>
+                      </a:extLst>
+                    </a:blip>
+                    <a:srcRect/>
+                    <a:stretch>
+                      <a:fillRect/>
+                    </a:stretch>
+                  </pic:blipFill>
+                  <pic:spPr bwMode="auto">
+                    <a:xfrm>
+                      <a:off x="0" y="0"/>
+                      <a:ext cx="4398535" cy="2199268"/>
+                    </a:xfrm>
+                    <a:prstGeom prst="rect">
+                      <a:avLst/>
+                    </a:prstGeom>
+                    <a:noFill/>
+                    <a:ln>
+                      <a:noFill/>
+                    </a:ln>
+                  </pic:spPr>
+                </pic:pic>
+              </a:graphicData>
+            </a:graphic>
+          </wp:inline>
+        </w:drawing>
+      </w:r>
+    </w:p>
+    <w:p>
+      <w:pPr>
+        <w:pStyle w:val="Heading2"/>
+      </w:pPr>
+      <w:r>
+        <w:t xml:space="preserve">2.4 Ace Attorney (2001), Story Portrayal </w:t>
+      </w:r>
+    </w:p>
+    <w:p>
+      <w:r>
+        <w:t xml:space="preserve">Representation of the player dialogue was inspired from visual novel aspect </w:t>
+      </w:r>
+      <w:r>
+        <w:t>games such</w:t>
+      </w:r>
+      <w:r>
+        <w:t xml:space="preserve"> Ace Attorney where the character where a dialogue box is clear for the player to see and interact with to progress through the story. </w:t>
+      </w:r>
+      <w:r>
+        <w:t xml:space="preserve"> Making a simpler representation for the story rather than animating a full cutscene. </w:t>
+      </w:r>
+    </w:p>
+    <w:p>
+      <w:r>
+        <w:rPr>
+          <w:noProof/>
+        </w:rPr>
+        <w:lastRenderedPageBreak/>
+        <w:drawing>
+          <wp:inline distT="0" distB="0" distL="0" distR="0" wp14:anchorId="7E9CD906" wp14:editId="0EA0BB3C">
+            <wp:extent cx="2642461" cy="1717600"/>
+            <wp:effectExtent l="0" t="0" r="5715" b="0"/>
+            <wp:docPr id="1775491385" name="Picture 2"/>
+            <wp:cNvGraphicFramePr>
+              <a:graphicFrameLocks xmlns:a="http://schemas.openxmlformats.org/drawingml/2006/main" noChangeAspect="1"/>
+            </wp:cNvGraphicFramePr>
+            <a:graphic xmlns:a="http://schemas.openxmlformats.org/drawingml/2006/main">
+              <a:graphicData uri="http://schemas.openxmlformats.org/drawingml/2006/picture">
+                <pic:pic xmlns:pic="http://schemas.openxmlformats.org/drawingml/2006/picture">
+                  <pic:nvPicPr>
+                    <pic:cNvPr id="0" name="Picture 2"/>
+                    <pic:cNvPicPr>
+                      <a:picLocks noChangeAspect="1" noChangeArrowheads="1"/>
+                    </pic:cNvPicPr>
+                  </pic:nvPicPr>
+                  <pic:blipFill>
+                    <a:blip r:embed="rId8">
+                      <a:extLst>
+                        <a:ext uri="{28A0092B-C50C-407E-A947-70E740481C1C}">
+                          <a14:useLocalDpi xmlns:a14="http://schemas.microsoft.com/office/drawing/2010/main" val="0"/>
+                        </a:ext>
+                      </a:extLst>
+                    </a:blip>
+                    <a:srcRect/>
+                    <a:stretch>
+                      <a:fillRect/>
+                    </a:stretch>
+                  </pic:blipFill>
+                  <pic:spPr bwMode="auto">
+                    <a:xfrm>
+                      <a:off x="0" y="0"/>
+                      <a:ext cx="2648951" cy="1721818"/>
+                    </a:xfrm>
+                    <a:prstGeom prst="rect">
+                      <a:avLst/>
+                    </a:prstGeom>
+                    <a:noFill/>
+                  </pic:spPr>
+                </pic:pic>
+              </a:graphicData>
+            </a:graphic>
+          </wp:inline>
+        </w:drawing>
+      </w:r>
+    </w:p>
+    <w:p>
+      <w:pPr>
         <w:pStyle w:val="Heading1"/>
         <w:jc w:val="both"/>
         <w:rPr>
@@ -1109,114 +1428,302 @@
           <w:sz w:val="22"/>
           <w:szCs w:val="22"/>
         </w:rPr>
-        <w:t>just a normal slime living your daily life, but now you must step up and defend your village</w:t>
-      </w:r>
-      <w:r>
-        <w:rPr>
-          <w:rFonts w:ascii="Arial" w:hAnsi="Arial" w:cs="Arial"/>
-          <w:sz w:val="22"/>
-          <w:szCs w:val="22"/>
-        </w:rPr>
-        <w:t xml:space="preserve"> only you have the ability to do this</w:t>
-      </w:r>
-      <w:r>
-        <w:rPr>
-          <w:rFonts w:ascii="Arial" w:hAnsi="Arial" w:cs="Arial"/>
-          <w:sz w:val="22"/>
-          <w:szCs w:val="22"/>
-        </w:rPr>
+        <w:t>s</w:t>
+      </w:r>
+      <w:r>
+        <w:rPr>
+          <w:rFonts w:ascii="Arial" w:hAnsi="Arial" w:cs="Arial"/>
+          <w:sz w:val="22"/>
+          <w:szCs w:val="22"/>
+        </w:rPr>
+        <w:t xml:space="preserve">lime going on a journey to the promised </w:t>
+      </w:r>
+      <w:r>
+        <w:rPr>
+          <w:rFonts w:ascii="Arial" w:hAnsi="Arial" w:cs="Arial"/>
+          <w:sz w:val="22"/>
+          <w:szCs w:val="22"/>
+        </w:rPr>
+        <w:t xml:space="preserve">great </w:t>
+      </w:r>
+      <w:r>
+        <w:rPr>
+          <w:rFonts w:ascii="Arial" w:hAnsi="Arial" w:cs="Arial"/>
+          <w:sz w:val="22"/>
+          <w:szCs w:val="22"/>
+        </w:rPr>
+        <w:t>slime kingdom, but the journey will be tough you will pass through many terrains, different encounters</w:t>
+      </w:r>
+      <w:r>
+        <w:rPr>
+          <w:rFonts w:ascii="Arial" w:hAnsi="Arial" w:cs="Arial"/>
+          <w:sz w:val="22"/>
+          <w:szCs w:val="22"/>
+        </w:rPr>
+        <w:t>,</w:t>
+      </w:r>
+      <w:r>
+        <w:rPr>
+          <w:rFonts w:ascii="Arial" w:hAnsi="Arial" w:cs="Arial"/>
+          <w:sz w:val="22"/>
+          <w:szCs w:val="22"/>
+        </w:rPr>
+        <w:t xml:space="preserve"> can you survive and make it to the end?</w:t>
+      </w:r>
+      <w:r>
+        <w:rPr>
+          <w:rFonts w:ascii="Arial" w:hAnsi="Arial" w:cs="Arial"/>
+          <w:sz w:val="22"/>
+          <w:szCs w:val="22"/>
+        </w:rPr>
+        <w:t>`</w:t>
+      </w:r>
+      <w:r>
+        <w:rPr>
+          <w:rFonts w:ascii="Arial" w:hAnsi="Arial" w:cs="Arial"/>
+          <w:sz w:val="22"/>
+          <w:szCs w:val="22"/>
+        </w:rPr>
+        <w:t xml:space="preserve"> </w:t>
+      </w:r>
+    </w:p>
+    <w:p>
+      <w:pPr>
+        <w:pStyle w:val="Heading3"/>
+        <w:rPr>
+          <w:rFonts w:ascii="Arial" w:hAnsi="Arial" w:cs="Arial"/>
+        </w:rPr>
+      </w:pPr>
+      <w:bookmarkStart w:id="0" w:name="_3.1.1_Player_Story"/>
+      <w:bookmarkEnd w:id="0"/>
+      <w:r>
+        <w:rPr>
+          <w:rFonts w:ascii="Arial" w:hAnsi="Arial" w:cs="Arial"/>
+        </w:rPr>
+        <w:t>3.</w:t>
+      </w:r>
+      <w:r>
+        <w:rPr>
+          <w:rFonts w:ascii="Arial" w:hAnsi="Arial" w:cs="Arial"/>
+        </w:rPr>
+        <w:t xml:space="preserve">1.1 </w:t>
+      </w:r>
+      <w:r>
+        <w:rPr>
+          <w:rFonts w:ascii="Arial" w:hAnsi="Arial" w:cs="Arial"/>
+        </w:rPr>
+        <w:t xml:space="preserve">Player Story </w:t>
+      </w:r>
+    </w:p>
+    <w:p>
+      <w:pPr>
+        <w:rPr>
+          <w:rFonts w:ascii="Arial" w:hAnsi="Arial" w:cs="Arial"/>
+          <w:sz w:val="22"/>
+          <w:szCs w:val="22"/>
+        </w:rPr>
+      </w:pPr>
+      <w:r>
+        <w:rPr>
+          <w:rFonts w:ascii="Arial" w:hAnsi="Arial" w:cs="Arial"/>
+          <w:sz w:val="22"/>
+          <w:szCs w:val="22"/>
+        </w:rPr>
+        <w:t xml:space="preserve">You </w:t>
+      </w:r>
+      <w:r>
+        <w:rPr>
+          <w:rFonts w:ascii="Arial" w:hAnsi="Arial" w:cs="Arial"/>
+          <w:sz w:val="22"/>
+          <w:szCs w:val="22"/>
+        </w:rPr>
+        <w:t xml:space="preserve">are just a slime, an ordinary slime, but rumours of the promised Slime kingdom emerge think about it - the fame, glory and most of all a better life why wouldn’t you not take it. The game begins at the start of the journey the forest.  </w:t>
+      </w:r>
+      <w:r>
+        <w:rPr>
+          <w:rFonts w:ascii="Arial" w:hAnsi="Arial" w:cs="Arial"/>
+          <w:sz w:val="22"/>
+          <w:szCs w:val="22"/>
+        </w:rPr>
+        <w:t xml:space="preserve"> </w:t>
+      </w:r>
+    </w:p>
+    <w:p>
+      <w:pPr>
+        <w:pStyle w:val="Heading3"/>
+        <w:rPr>
+          <w:rFonts w:ascii="Arial" w:hAnsi="Arial" w:cs="Arial"/>
+        </w:rPr>
+      </w:pPr>
+      <w:r>
+        <w:rPr>
+          <w:rFonts w:ascii="Arial" w:hAnsi="Arial" w:cs="Arial"/>
+        </w:rPr>
+        <w:t>3.1</w:t>
+      </w:r>
+      <w:r>
+        <w:rPr>
+          <w:rFonts w:ascii="Arial" w:hAnsi="Arial" w:cs="Arial"/>
+        </w:rPr>
+        <w:t xml:space="preserve">.2 General Story </w:t>
+      </w:r>
+    </w:p>
+    <w:p>
+      <w:r>
+        <w:t xml:space="preserve">The game begins at the point of the characters travel, </w:t>
+      </w:r>
+      <w:r>
+        <w:t xml:space="preserve">where </w:t>
+      </w:r>
+      <w:r>
+        <w:t xml:space="preserve">each few waves of enemies having a different terrain </w:t>
+      </w:r>
+      <w:r>
+        <w:t>reflecting</w:t>
+      </w:r>
+      <w:r>
+        <w:t xml:space="preserve"> on the enemy and</w:t>
+      </w:r>
+      <w:r>
+        <w:t xml:space="preserve"> the different points the player is at </w:t>
+      </w:r>
+      <w:r>
+        <w:t>within</w:t>
+      </w:r>
+      <w:r>
+        <w:t xml:space="preserve"> the story.</w:t>
+      </w:r>
+    </w:p>
+    <w:p>
+      <w:r>
+        <w:t>You have lived</w:t>
+      </w:r>
+      <w:r>
+        <w:t xml:space="preserve"> your whole life in your hometown sure everyday is fine and dandy but you want more than just walking aimlessly all day doing nothing but then a rumour emerges in your village, there is a place, a promised land for the better but to get there you need to go on a dangerous journey to the Kingdom. In hopes for adventure and a better life you decide its time. </w:t>
+      </w:r>
+      <w:r>
+        <w:t xml:space="preserve"> </w:t>
+      </w:r>
+    </w:p>
+    <w:p>
+      <w:pPr>
+        <w:pStyle w:val="Heading2"/>
+      </w:pPr>
+      <w:r>
+        <w:t xml:space="preserve">3.2 Game Aesthetics </w:t>
+      </w:r>
+    </w:p>
+    <w:p>
+      <w:r>
+        <w:t xml:space="preserve">The aesthetics of this game will be </w:t>
+      </w:r>
+      <w:r>
+        <w:t xml:space="preserve">mostly </w:t>
+      </w:r>
+      <w:r>
+        <w:t xml:space="preserve">simple and stylised, using bright colours and a </w:t>
+      </w:r>
+      <w:r>
+        <w:t>detail to the environment for a more immersive experience</w:t>
+      </w:r>
+      <w:r>
+        <w:t>. The visuals will</w:t>
+      </w:r>
+      <w:r>
+        <w:t xml:space="preserve"> have some </w:t>
+      </w:r>
+      <w:r>
+        <w:t xml:space="preserve">realism </w:t>
+      </w:r>
+      <w:r>
+        <w:t>via some physics to the slime as well as some possible environmental effects like grass movement.</w:t>
+      </w:r>
+    </w:p>
+    <w:p>
+      <w:r>
+        <w:t xml:space="preserve">This approach is chosen to keep the art style </w:t>
+      </w:r>
+      <w:r>
+        <w:t>visually appealing</w:t>
+      </w:r>
+      <w:r>
+        <w:t xml:space="preserve"> </w:t>
+      </w:r>
+      <w:r>
+        <w:t xml:space="preserve"> for players</w:t>
+      </w:r>
+      <w:r>
+        <w:t xml:space="preserve"> to visualise</w:t>
+      </w:r>
+      <w:r>
+        <w:t xml:space="preserve"> and immerse themselves in the world </w:t>
+      </w:r>
+      <w:r>
+        <w:t xml:space="preserve"> </w:t>
+      </w:r>
+      <w:r>
+        <w:t>whilst some models may be kept simple to make the game not too performance intensive</w:t>
+      </w:r>
+      <w:r>
         <w:t xml:space="preserve">. </w:t>
       </w:r>
+      <w:r>
+        <w:t>Most a</w:t>
+      </w:r>
+      <w:r>
+        <w:t xml:space="preserve">ssets added </w:t>
+      </w:r>
+      <w:r>
+        <w:t>will</w:t>
+      </w:r>
+      <w:r>
+        <w:t xml:space="preserve"> follow the same colourful style to maintain a cohesive visual identity across the game.</w:t>
+      </w:r>
+    </w:p>
+    <w:p>
+      <w:pPr>
+        <w:pStyle w:val="Heading2"/>
+      </w:pPr>
+      <w:r>
+        <w:lastRenderedPageBreak/>
+        <w:t>3.3 Game Characters</w:t>
+      </w:r>
     </w:p>
     <w:p>
       <w:pPr>
         <w:pStyle w:val="Heading3"/>
-        <w:rPr>
-          <w:rFonts w:ascii="Arial" w:hAnsi="Arial" w:cs="Arial"/>
-        </w:rPr>
-      </w:pPr>
-      <w:r>
-        <w:rPr>
-          <w:rFonts w:ascii="Arial" w:hAnsi="Arial" w:cs="Arial"/>
-        </w:rPr>
-        <w:t>3.</w:t>
-      </w:r>
-      <w:r>
-        <w:rPr>
-          <w:rFonts w:ascii="Arial" w:hAnsi="Arial" w:cs="Arial"/>
-        </w:rPr>
-        <w:t xml:space="preserve">1.1 </w:t>
-      </w:r>
-      <w:r>
-        <w:rPr>
-          <w:rFonts w:ascii="Arial" w:hAnsi="Arial" w:cs="Arial"/>
-        </w:rPr>
-        <w:t xml:space="preserve">Player Story </w:t>
-      </w:r>
-    </w:p>
-    <w:p>
-      <w:pPr>
-        <w:rPr>
-          <w:rFonts w:ascii="Arial" w:hAnsi="Arial" w:cs="Arial"/>
-          <w:sz w:val="22"/>
-          <w:szCs w:val="22"/>
-        </w:rPr>
-      </w:pPr>
-      <w:r>
-        <w:rPr>
-          <w:rFonts w:ascii="Arial" w:hAnsi="Arial" w:cs="Arial"/>
-          <w:sz w:val="22"/>
-          <w:szCs w:val="22"/>
-        </w:rPr>
-        <w:t xml:space="preserve">You wonder out as usual for an adventure but whilst wondering about, you hear about an attempted raid on your village, it is up to you to fend these fiends off and protect your hometown. The game starts out to when you are wondering out of the village. </w:t>
-      </w:r>
+      </w:pPr>
+      <w:r>
+        <w:t xml:space="preserve">3.3.1 Slime </w:t>
+      </w:r>
+    </w:p>
+    <w:p>
+      <w:r>
+        <w:t>The player</w:t>
+      </w:r>
+      <w:r>
+        <w:t xml:space="preserve">, being a slime. Player Story in </w:t>
+      </w:r>
+      <w:hyperlink w:anchor="_3.1.1_Player_Story" w:history="1">
+        <w:r>
+          <w:rPr>
+            <w:rStyle w:val="Hyperlink"/>
+          </w:rPr>
+          <w:t>Section 3.11</w:t>
+        </w:r>
+      </w:hyperlink>
     </w:p>
     <w:p>
       <w:pPr>
         <w:pStyle w:val="Heading3"/>
-        <w:rPr>
-          <w:rFonts w:ascii="Arial" w:hAnsi="Arial" w:cs="Arial"/>
-        </w:rPr>
-      </w:pPr>
-      <w:r>
-        <w:rPr>
-          <w:rFonts w:ascii="Arial" w:hAnsi="Arial" w:cs="Arial"/>
-        </w:rPr>
-        <w:lastRenderedPageBreak/>
-        <w:t>3.1</w:t>
-      </w:r>
-      <w:r>
-        <w:rPr>
-          <w:rFonts w:ascii="Arial" w:hAnsi="Arial" w:cs="Arial"/>
-        </w:rPr>
-        <w:t xml:space="preserve">.2 General Story </w:t>
-      </w:r>
-    </w:p>
-    <w:p>
-      <w:r>
-        <w:t>This is the story that takes place around the player and explains the setting and events of the game. Each level may include short story-related scenes or dialogue to build context.</w:t>
-      </w:r>
-    </w:p>
-    <w:p>
-      <w:r>
-        <w:t xml:space="preserve">You live in a peaceful village known for its </w:t>
-      </w:r>
-      <w:r>
-        <w:t>peaceful coexistence with other creatures</w:t>
-      </w:r>
-      <w:r>
-        <w:t>. One day, while wandering outside the village as usual, rumours begin spreading of hostile creatures preparing to raid the area. What first seemed like distant trouble quickly becomes a real threat.</w:t>
-      </w:r>
-    </w:p>
-    <w:p>
-      <w:r>
-        <w:t>As the attacks begin, it becomes your responsibility to defend your home and protect the people living there. Each wave represents enemies attempting to break through the village defences. The player must fight them off and survive to keep the</w:t>
-      </w:r>
-      <w:r>
-        <w:t>mselves and the</w:t>
-      </w:r>
-      <w:r>
-        <w:t xml:space="preserve"> village safe.</w:t>
+      </w:pPr>
+      <w:r>
+        <w:t>3.3.2 Enemies</w:t>
+      </w:r>
+    </w:p>
+    <w:p>
+      <w:r>
+        <w:t>Each terrain the player is in will have different enemies or a mixture of combined enemies reflecting the current point of the story the player is in, and enemies will have the same mechanics to another – finding and killing the player.</w:t>
       </w:r>
     </w:p>
     <w:p>
@@ -1224,35 +1731,129 @@
         <w:pStyle w:val="Heading2"/>
       </w:pPr>
       <w:r>
-        <w:t xml:space="preserve">3.2 Game Aesthetics </w:t>
-      </w:r>
-    </w:p>
-    <w:p>
-      <w:r>
-        <w:t>The aesthetics of this game will be simple and stylised, using bright colours and a cartoon-like appearance similar to games such as Minecraft. The visuals will avoid realism and instead focus on clear shapes, smooth textures, and easy-to-recognise characters and environments.</w:t>
-      </w:r>
-    </w:p>
-    <w:p>
-      <w:r>
-        <w:t xml:space="preserve">This approach is chosen to keep the art style consistent, </w:t>
-      </w:r>
-      <w:r>
-        <w:t xml:space="preserve">easily </w:t>
-      </w:r>
-      <w:r>
-        <w:t xml:space="preserve"> for players</w:t>
-      </w:r>
-      <w:r>
-        <w:t xml:space="preserve"> to visualise</w:t>
-      </w:r>
-      <w:r>
-        <w:t>, a</w:t>
-      </w:r>
-      <w:r>
-        <w:t xml:space="preserve">s well as being </w:t>
-      </w:r>
-      <w:r>
-        <w:t>achievable within time constraints. Assets added later will follow the same simple, colourful style to maintain a cohesive visual identity across the game.</w:t>
+        <w:t xml:space="preserve">3.4 Game Content </w:t>
+      </w:r>
+    </w:p>
+    <w:p>
+      <w:r>
+        <w:t xml:space="preserve">Each level will have a set number of waves, this will generate groups of enemies and will progressively get harder as the story progresses. Starting levels will take around 5 mins to complete whilst levels further into the game will take longer to around 20-30mins. </w:t>
+      </w:r>
+    </w:p>
+    <w:p>
+      <w:r>
+        <w:t>Some of these levels may include:</w:t>
+      </w:r>
+      <w:r>
+        <w:t xml:space="preserve">  </w:t>
+      </w:r>
+    </w:p>
+    <w:p>
+      <w:pPr>
+        <w:pStyle w:val="Heading3"/>
+      </w:pPr>
+      <w:r>
+        <w:t xml:space="preserve">3.4.1 </w:t>
+      </w:r>
+      <w:r>
+        <w:t>Forrest</w:t>
+      </w:r>
+    </w:p>
+    <w:p>
+      <w:pPr>
+        <w:rPr>
+          <w:b/>
+          <w:bCs/>
+        </w:rPr>
+      </w:pPr>
+      <w:r>
+        <w:rPr>
+          <w:b/>
+          <w:bCs/>
+        </w:rPr>
+        <w:t>Story</w:t>
+      </w:r>
+    </w:p>
+    <w:p>
+      <w:pPr>
+        <w:rPr>
+          <w:b/>
+          <w:bCs/>
+        </w:rPr>
+      </w:pPr>
+      <w:r>
+        <w:rPr>
+          <w:b/>
+          <w:bCs/>
+        </w:rPr>
+        <w:t>Gameplay</w:t>
+      </w:r>
+    </w:p>
+    <w:p>
+      <w:pPr>
+        <w:pStyle w:val="Heading3"/>
+      </w:pPr>
+      <w:r>
+        <w:t>3.4.</w:t>
+      </w:r>
+      <w:r>
+        <w:t>2</w:t>
+      </w:r>
+      <w:r>
+        <w:t xml:space="preserve"> </w:t>
+      </w:r>
+      <w:r>
+        <w:t>Swamp</w:t>
+      </w:r>
+    </w:p>
+    <w:p>
+      <w:pPr>
+        <w:rPr>
+          <w:b/>
+          <w:bCs/>
+        </w:rPr>
+      </w:pPr>
+      <w:r>
+        <w:rPr>
+          <w:b/>
+          <w:bCs/>
+        </w:rPr>
+        <w:t>Story</w:t>
+      </w:r>
+    </w:p>
+    <w:p>
+      <w:pPr>
+        <w:rPr>
+          <w:b/>
+          <w:bCs/>
+        </w:rPr>
+      </w:pPr>
+      <w:r>
+        <w:rPr>
+          <w:b/>
+          <w:bCs/>
+        </w:rPr>
+        <w:t>Gameplay</w:t>
+      </w:r>
+    </w:p>
+    <w:p>
+      <w:pPr>
+        <w:pStyle w:val="Heading3"/>
+        <w:rPr>
+          <w:b/>
+          <w:bCs/>
+        </w:rPr>
+      </w:pPr>
+      <w:r>
+        <w:t>3.4.</w:t>
+      </w:r>
+      <w:r>
+        <w:t>3</w:t>
+      </w:r>
+      <w:r>
+        <w:t xml:space="preserve"> </w:t>
+      </w:r>
+      <w:r>
+        <w:t>Badlands</w:t>
       </w:r>
     </w:p>
     <w:p>
@@ -1275,6 +1876,36 @@
       </w:r>
     </w:p>
     <w:p>
+      <w:r>
+        <w:t>Currently, I have implemented some core features within the game.</w:t>
+      </w:r>
+    </w:p>
+    <w:p>
+      <w:r>
+        <w:t xml:space="preserve">GitHub link: </w:t>
+      </w:r>
+      <w:hyperlink r:id="rId9" w:history="1">
+        <w:r>
+          <w:rPr>
+            <w:rStyle w:val="Hyperlink"/>
+          </w:rPr>
+          <w:t>https://github.com/WilliamCheung2004/Slime</w:t>
+        </w:r>
+        <w:r>
+          <w:rPr>
+            <w:rStyle w:val="Hyperlink"/>
+          </w:rPr>
+          <w:t>-</w:t>
+        </w:r>
+        <w:r>
+          <w:rPr>
+            <w:rStyle w:val="Hyperlink"/>
+          </w:rPr>
+          <w:t>Fight-</w:t>
+        </w:r>
+      </w:hyperlink>
+    </w:p>
+    <w:p>
       <w:pPr>
         <w:pStyle w:val="Heading2"/>
         <w:jc w:val="both"/>
@@ -1290,6 +1921,7 @@
           <w:sz w:val="28"/>
           <w:szCs w:val="28"/>
         </w:rPr>
+        <w:lastRenderedPageBreak/>
         <w:t xml:space="preserve">References </w:t>
       </w:r>
     </w:p>
@@ -1341,7 +1973,7 @@
                     <pic:cNvPicPr/>
                   </pic:nvPicPr>
                   <pic:blipFill>
-                    <a:blip r:embed="rId5"/>
+                    <a:blip r:embed="rId10"/>
                     <a:stretch>
                       <a:fillRect/>
                     </a:stretch>
@@ -1364,7 +1996,9 @@
     </w:p>
     <w:p>
       <w:r>
-        <w:lastRenderedPageBreak/>
+        <w:rPr>
+          <w:noProof/>
+        </w:rPr>
         <w:drawing>
           <wp:inline distT="0" distB="0" distL="0" distR="0" wp14:anchorId="11C876BE" wp14:editId="5F82106D">
             <wp:extent cx="5731510" cy="3322320"/>
@@ -1381,7 +2015,7 @@
                     <pic:cNvPicPr/>
                   </pic:nvPicPr>
                   <pic:blipFill>
-                    <a:blip r:embed="rId6"/>
+                    <a:blip r:embed="rId11"/>
                     <a:stretch>
                       <a:fillRect/>
                     </a:stretch>
@@ -1436,9 +2070,11 @@
       <w:r>
         <w:rPr>
           <w:rFonts w:ascii="Arial" w:hAnsi="Arial" w:cs="Arial"/>
-          <w:sz w:val="22"/>
-          <w:szCs w:val="22"/>
-        </w:rPr>
+          <w:noProof/>
+          <w:sz w:val="22"/>
+          <w:szCs w:val="22"/>
+        </w:rPr>
+        <w:lastRenderedPageBreak/>
         <w:drawing>
           <wp:inline distT="0" distB="0" distL="0" distR="0" wp14:anchorId="5B667B20" wp14:editId="58D18214">
             <wp:extent cx="5731510" cy="3258185"/>
@@ -1455,7 +2091,7 @@
                     <pic:cNvPicPr/>
                   </pic:nvPicPr>
                   <pic:blipFill>
-                    <a:blip r:embed="rId7"/>
+                    <a:blip r:embed="rId12"/>
                     <a:stretch>
                       <a:fillRect/>
                     </a:stretch>
@@ -2779,6 +3415,41 @@
       </w:tblBorders>
     </w:tblPr>
   </w:style>
+  <w:style w:type="character" w:styleId="Hyperlink">
+    <w:name w:val="Hyperlink"/>
+    <w:basedOn w:val="DefaultParagraphFont"/>
+    <w:uiPriority w:val="99"/>
+    <w:unhideWhenUsed/>
+    <w:rsid w:val="00D558F4"/>
+    <w:rPr>
+      <w:color w:val="467886" w:themeColor="hyperlink"/>
+      <w:u w:val="single"/>
+    </w:rPr>
+  </w:style>
+  <w:style w:type="character" w:styleId="UnresolvedMention">
+    <w:name w:val="Unresolved Mention"/>
+    <w:basedOn w:val="DefaultParagraphFont"/>
+    <w:uiPriority w:val="99"/>
+    <w:semiHidden/>
+    <w:unhideWhenUsed/>
+    <w:rsid w:val="00D558F4"/>
+    <w:rPr>
+      <w:color w:val="605E5C"/>
+      <w:shd w:val="clear" w:color="auto" w:fill="E1DFDD"/>
+    </w:rPr>
+  </w:style>
+  <w:style w:type="character" w:styleId="FollowedHyperlink">
+    <w:name w:val="FollowedHyperlink"/>
+    <w:basedOn w:val="DefaultParagraphFont"/>
+    <w:uiPriority w:val="99"/>
+    <w:semiHidden/>
+    <w:unhideWhenUsed/>
+    <w:rsid w:val="00192FA4"/>
+    <w:rPr>
+      <w:color w:val="96607D" w:themeColor="followedHyperlink"/>
+      <w:u w:val="single"/>
+    </w:rPr>
+  </w:style>
 </w:styles>
 </file>
 

</xml_diff>

<commit_message>
Game Report Update + Slime Physics
> Added initial designs on menu to report
>Added slime physics to slime in game
</commit_message>
<xml_diff>
--- a/GameReport.docx
+++ b/GameReport.docx
@@ -5,73 +5,33 @@
     <w:p>
       <w:pPr>
         <w:pStyle w:val="Heading1"/>
-        <w:jc w:val="both"/>
-        <w:rPr>
-          <w:rFonts w:ascii="Arial" w:hAnsi="Arial" w:cs="Arial"/>
-          <w:sz w:val="30"/>
-          <w:szCs w:val="30"/>
-        </w:rPr>
-      </w:pPr>
-      <w:r>
-        <w:rPr>
-          <w:rFonts w:ascii="Arial" w:hAnsi="Arial" w:cs="Arial"/>
-          <w:sz w:val="30"/>
-          <w:szCs w:val="30"/>
-        </w:rPr>
+      </w:pPr>
+      <w:r>
         <w:t>Slime Fight</w:t>
       </w:r>
       <w:r>
-        <w:rPr>
-          <w:rFonts w:ascii="Arial" w:hAnsi="Arial" w:cs="Arial"/>
-          <w:sz w:val="30"/>
-          <w:szCs w:val="30"/>
-        </w:rPr>
         <w:t xml:space="preserve"> </w:t>
       </w:r>
       <w:r>
         <w:rPr>
           <w:rFonts w:ascii="Segoe UI Emoji" w:hAnsi="Segoe UI Emoji" w:cs="Segoe UI Emoji"/>
-          <w:sz w:val="30"/>
-          <w:szCs w:val="30"/>
         </w:rPr>
         <w:t>⚔️</w:t>
       </w:r>
     </w:p>
     <w:p>
       <w:pPr>
-        <w:pStyle w:val="Heading1"/>
-        <w:jc w:val="both"/>
-        <w:rPr>
-          <w:rFonts w:ascii="Arial" w:hAnsi="Arial" w:cs="Arial"/>
-          <w:sz w:val="28"/>
-          <w:szCs w:val="28"/>
-        </w:rPr>
-      </w:pPr>
-      <w:r>
-        <w:rPr>
-          <w:rFonts w:ascii="Arial" w:hAnsi="Arial" w:cs="Arial"/>
-          <w:sz w:val="28"/>
-          <w:szCs w:val="28"/>
-        </w:rPr>
+        <w:pStyle w:val="Heading2"/>
+      </w:pPr>
+      <w:r>
         <w:t>1. Summary</w:t>
       </w:r>
     </w:p>
     <w:p>
       <w:pPr>
-        <w:pStyle w:val="Heading2"/>
-        <w:jc w:val="both"/>
-        <w:rPr>
-          <w:rFonts w:ascii="Arial" w:hAnsi="Arial" w:cs="Arial"/>
-          <w:sz w:val="28"/>
-          <w:szCs w:val="28"/>
-        </w:rPr>
-      </w:pPr>
-      <w:r>
-        <w:rPr>
-          <w:rFonts w:ascii="Arial" w:hAnsi="Arial" w:cs="Arial"/>
-          <w:sz w:val="28"/>
-          <w:szCs w:val="28"/>
-        </w:rPr>
+        <w:pStyle w:val="Heading3"/>
+      </w:pPr>
+      <w:r>
         <w:t>1.1 Genre</w:t>
       </w:r>
     </w:p>
@@ -191,99 +151,106 @@
     </w:p>
     <w:p>
       <w:pPr>
-        <w:pStyle w:val="Heading2"/>
-        <w:jc w:val="both"/>
+        <w:pStyle w:val="Heading3"/>
+      </w:pPr>
+      <w:r>
+        <w:t>1.2 Synopsis</w:t>
+      </w:r>
+    </w:p>
+    <w:p>
+      <w:pPr>
+        <w:rPr>
+          <w:sz w:val="22"/>
+          <w:szCs w:val="22"/>
+        </w:rPr>
+      </w:pPr>
+      <w:r>
+        <w:rPr>
+          <w:sz w:val="22"/>
+          <w:szCs w:val="22"/>
+        </w:rPr>
+        <w:t>The game is a first-person, wave-based defence experience set in a small village under attack. The player takes the role of a local slime who must protect their home from incoming enemies.</w:t>
+      </w:r>
+    </w:p>
+    <w:p>
+      <w:pPr>
+        <w:rPr>
+          <w:sz w:val="22"/>
+          <w:szCs w:val="22"/>
+        </w:rPr>
+      </w:pPr>
+      <w:r>
+        <w:rPr>
+          <w:sz w:val="22"/>
+          <w:szCs w:val="22"/>
+        </w:rPr>
+        <w:t>Each wave begins with a short story briefing that explains the situation and the player’s objective. The player starts outside or on the edge of the village and must prepare for incoming waves of enemies. Using movement, combat, and positioning, the player defends key areas and prevents enemies from overwhelming the village.</w:t>
+      </w:r>
+    </w:p>
+    <w:p>
+      <w:pPr>
+        <w:rPr>
+          <w:sz w:val="22"/>
+          <w:szCs w:val="22"/>
+        </w:rPr>
+      </w:pPr>
+      <w:r>
+        <w:rPr>
+          <w:sz w:val="22"/>
+          <w:szCs w:val="22"/>
+        </w:rPr>
+        <w:t>Enemies arrive in increasing waves, becoming more difficult over time. The player must survive for as long as possible while protecting the environment and maintaining their health and resources.</w:t>
+      </w:r>
+    </w:p>
+    <w:p>
+      <w:pPr>
+        <w:rPr>
+          <w:sz w:val="22"/>
+          <w:szCs w:val="22"/>
+        </w:rPr>
+      </w:pPr>
+      <w:r>
+        <w:rPr>
+          <w:sz w:val="22"/>
+          <w:szCs w:val="22"/>
+        </w:rPr>
+        <w:t>The game is presented from a first-person perspective, allowing the player to interact directly with the world and enemies. Combat is simple and stylised, with enemies disappearing into smoke when defeated to maintain the game’s cartoon aesthetic.</w:t>
+      </w:r>
+    </w:p>
+    <w:p>
+      <w:pPr>
+        <w:rPr>
+          <w:sz w:val="22"/>
+          <w:szCs w:val="22"/>
+        </w:rPr>
+      </w:pPr>
+      <w:r>
+        <w:rPr>
+          <w:sz w:val="22"/>
+          <w:szCs w:val="22"/>
+        </w:rPr>
+        <w:t>Completing waves or surviving for a set period progresses the players level allowing them to unlock upgrades to progress into further waves.</w:t>
+      </w:r>
+    </w:p>
+    <w:p>
+      <w:pPr>
+        <w:pStyle w:val="Heading3"/>
+      </w:pPr>
+      <w:r>
+        <w:t>1.3 Target Audience</w:t>
+      </w:r>
+    </w:p>
+    <w:p>
+      <w:pPr>
         <w:rPr>
           <w:rFonts w:ascii="Arial" w:hAnsi="Arial" w:cs="Arial"/>
-          <w:sz w:val="28"/>
-          <w:szCs w:val="28"/>
+          <w:sz w:val="22"/>
+          <w:szCs w:val="22"/>
         </w:rPr>
       </w:pPr>
       <w:r>
         <w:rPr>
           <w:rFonts w:ascii="Arial" w:hAnsi="Arial" w:cs="Arial"/>
-          <w:sz w:val="28"/>
-          <w:szCs w:val="28"/>
-        </w:rPr>
-        <w:t>1.2 Synopsis</w:t>
-      </w:r>
-    </w:p>
-    <w:p>
-      <w:r>
-        <w:t>The game is a first-person, wave-based defence experience set in a small village under attack. The player takes the role of a local</w:t>
-      </w:r>
-      <w:r>
-        <w:t xml:space="preserve"> slime</w:t>
-      </w:r>
-      <w:r>
-        <w:t xml:space="preserve"> who must protect their home from incoming enemies.</w:t>
-      </w:r>
-    </w:p>
-    <w:p>
-      <w:r>
-        <w:t xml:space="preserve">Each </w:t>
-      </w:r>
-      <w:r>
-        <w:t>wave</w:t>
-      </w:r>
-      <w:r>
-        <w:t xml:space="preserve"> begins with a short story briefing that explains the situation and the player’s objective. The player starts outside or on the edge of the village and must prepare for incoming waves of enemies. Using movement, combat, and positioning, the player defends key areas and prevents enemies from overwhelming the village.</w:t>
-      </w:r>
-    </w:p>
-    <w:p>
-      <w:r>
-        <w:t>Enemies arrive in increasing waves, becoming more difficult over time. The player must survive for as long as possible while protecting the environment and maintaining their health and resources.</w:t>
-      </w:r>
-    </w:p>
-    <w:p>
-      <w:r>
-        <w:t>The game is presented from a first-person perspective, allowing the player to interact directly with the world and enemies. Combat is simple and stylised, with enemies disappearing into smoke when defeated to maintain the game’s cartoon aesthetic.</w:t>
-      </w:r>
-    </w:p>
-    <w:p>
-      <w:r>
-        <w:t xml:space="preserve">Completing waves or surviving for a set period progresses the </w:t>
-      </w:r>
-      <w:r>
-        <w:t xml:space="preserve">players </w:t>
-      </w:r>
-      <w:r>
-        <w:t>level</w:t>
-      </w:r>
-      <w:r>
-        <w:t xml:space="preserve"> allowing them to unlock upgrades to progress into further waves.</w:t>
-      </w:r>
-    </w:p>
-    <w:p>
-      <w:pPr>
-        <w:pStyle w:val="Heading2"/>
-        <w:jc w:val="both"/>
-        <w:rPr>
-          <w:rFonts w:ascii="Arial" w:hAnsi="Arial" w:cs="Arial"/>
-          <w:sz w:val="28"/>
-          <w:szCs w:val="28"/>
-        </w:rPr>
-      </w:pPr>
-      <w:r>
-        <w:rPr>
-          <w:rFonts w:ascii="Arial" w:hAnsi="Arial" w:cs="Arial"/>
-          <w:sz w:val="28"/>
-          <w:szCs w:val="28"/>
-        </w:rPr>
-        <w:t>1.3 Target Audience</w:t>
-      </w:r>
-    </w:p>
-    <w:p>
-      <w:pPr>
-        <w:rPr>
-          <w:rFonts w:ascii="Arial" w:hAnsi="Arial" w:cs="Arial"/>
-          <w:sz w:val="22"/>
-          <w:szCs w:val="22"/>
-        </w:rPr>
-      </w:pPr>
-      <w:r>
-        <w:rPr>
-          <w:rFonts w:ascii="Arial" w:hAnsi="Arial" w:cs="Arial"/>
           <w:sz w:val="22"/>
           <w:szCs w:val="22"/>
         </w:rPr>
@@ -292,20 +259,9 @@
     </w:p>
     <w:p>
       <w:pPr>
-        <w:pStyle w:val="Heading2"/>
-        <w:jc w:val="both"/>
-        <w:rPr>
-          <w:rFonts w:ascii="Arial" w:hAnsi="Arial" w:cs="Arial"/>
-          <w:sz w:val="28"/>
-          <w:szCs w:val="28"/>
-        </w:rPr>
-      </w:pPr>
-      <w:r>
-        <w:rPr>
-          <w:rFonts w:ascii="Arial" w:hAnsi="Arial" w:cs="Arial"/>
-          <w:sz w:val="28"/>
-          <w:szCs w:val="28"/>
-        </w:rPr>
+        <w:pStyle w:val="Heading3"/>
+      </w:pPr>
+      <w:r>
         <w:t xml:space="preserve">1.4 Game experience </w:t>
       </w:r>
     </w:p>
@@ -450,20 +406,9 @@
     </w:p>
     <w:p>
       <w:pPr>
-        <w:pStyle w:val="Heading2"/>
-        <w:jc w:val="both"/>
-        <w:rPr>
-          <w:rFonts w:ascii="Arial" w:hAnsi="Arial" w:cs="Arial"/>
-          <w:sz w:val="28"/>
-          <w:szCs w:val="28"/>
-        </w:rPr>
-      </w:pPr>
-      <w:r>
-        <w:rPr>
-          <w:rFonts w:ascii="Arial" w:hAnsi="Arial" w:cs="Arial"/>
-          <w:sz w:val="28"/>
-          <w:szCs w:val="28"/>
-        </w:rPr>
+        <w:pStyle w:val="Heading3"/>
+      </w:pPr>
+      <w:r>
         <w:t>1.5 MoSCoW</w:t>
       </w:r>
     </w:p>
@@ -1048,26 +993,15 @@
     </w:p>
     <w:p>
       <w:pPr>
-        <w:pStyle w:val="Heading1"/>
-        <w:jc w:val="both"/>
-        <w:rPr>
-          <w:rFonts w:ascii="Arial" w:hAnsi="Arial" w:cs="Arial"/>
-          <w:sz w:val="28"/>
-          <w:szCs w:val="28"/>
-        </w:rPr>
-      </w:pPr>
-      <w:r>
-        <w:rPr>
-          <w:rFonts w:ascii="Arial" w:hAnsi="Arial" w:cs="Arial"/>
-          <w:sz w:val="28"/>
-          <w:szCs w:val="28"/>
-        </w:rPr>
+        <w:pStyle w:val="Heading2"/>
+      </w:pPr>
+      <w:r>
         <w:t xml:space="preserve">2. Background </w:t>
       </w:r>
     </w:p>
     <w:p>
       <w:pPr>
-        <w:pStyle w:val="Heading2"/>
+        <w:pStyle w:val="Heading3"/>
       </w:pPr>
       <w:r>
         <w:t>2.</w:t>
@@ -1081,13 +1015,26 @@
     </w:p>
     <w:p>
       <w:r>
+        <w:t xml:space="preserve">Pixel Dungeon similarly to typical rogue games  has a character selection that the player chooses a character which restricts them to a certain playstyle due to the equipment or stats of different characters, each having their own strengths and weaknesses.  </w:t>
+      </w:r>
+    </w:p>
+    <w:p>
+      <w:pPr>
+        <w:rPr>
+          <w:sz w:val="22"/>
+          <w:szCs w:val="22"/>
+        </w:rPr>
+      </w:pPr>
+      <w:r>
         <w:rPr>
           <w:noProof/>
+          <w:sz w:val="22"/>
+          <w:szCs w:val="22"/>
         </w:rPr>
         <w:drawing>
-          <wp:inline distT="0" distB="0" distL="0" distR="0" wp14:anchorId="2B5D7DC5" wp14:editId="3D932406">
-            <wp:extent cx="1332854" cy="2369850"/>
-            <wp:effectExtent l="0" t="0" r="1270" b="0"/>
+          <wp:inline distT="0" distB="0" distL="0" distR="0" wp14:anchorId="2B5D7DC5" wp14:editId="3030B376">
+            <wp:extent cx="1086875" cy="1932494"/>
+            <wp:effectExtent l="0" t="0" r="0" b="0"/>
             <wp:docPr id="1847532206" name="Picture 4" descr="Shattered Pixel Dungeon - Android Apps on Google Play"/>
             <wp:cNvGraphicFramePr>
               <a:graphicFrameLocks xmlns:a="http://schemas.openxmlformats.org/drawingml/2006/main" noChangeAspect="1"/>
@@ -1117,7 +1064,7 @@
                   <pic:spPr bwMode="auto">
                     <a:xfrm>
                       <a:off x="0" y="0"/>
-                      <a:ext cx="1343824" cy="2389355"/>
+                      <a:ext cx="1099780" cy="1955439"/>
                     </a:xfrm>
                     <a:prstGeom prst="rect">
                       <a:avLst/>
@@ -1134,37 +1081,63 @@
         </w:drawing>
       </w:r>
     </w:p>
-    <w:p/>
+    <w:p>
+      <w:pPr>
+        <w:rPr>
+          <w:sz w:val="22"/>
+          <w:szCs w:val="22"/>
+        </w:rPr>
+      </w:pPr>
+    </w:p>
+    <w:p>
+      <w:pPr>
+        <w:pStyle w:val="Heading3"/>
+      </w:pPr>
+      <w:r>
+        <w:t xml:space="preserve">2.2 </w:t>
+      </w:r>
+      <w:r>
+        <w:t xml:space="preserve">Diep.io (2016), </w:t>
+      </w:r>
+      <w:r>
+        <w:t xml:space="preserve">Upgrades Skills </w:t>
+      </w:r>
+    </w:p>
+    <w:p>
+      <w:pPr>
+        <w:rPr>
+          <w:sz w:val="22"/>
+          <w:szCs w:val="22"/>
+        </w:rPr>
+      </w:pPr>
+      <w:r>
+        <w:rPr>
+          <w:sz w:val="22"/>
+          <w:szCs w:val="22"/>
+        </w:rPr>
+        <w:t xml:space="preserve">Like most games in survival upgrades are an important aspect to progression and survival of the player. </w:t>
+      </w:r>
+      <w:r>
+        <w:rPr>
+          <w:sz w:val="22"/>
+          <w:szCs w:val="22"/>
+        </w:rPr>
+        <w:t xml:space="preserve">Players must obtain exp points from defeating objects each level increase giving upgrade the points the player must use to increase their power, as the player increases in level these are harder to obtain. </w:t>
+      </w:r>
+    </w:p>
     <w:p>
       <w:pPr>
         <w:pStyle w:val="Heading2"/>
-      </w:pPr>
-      <w:r>
-        <w:lastRenderedPageBreak/>
-        <w:t xml:space="preserve">2.2 </w:t>
-      </w:r>
-      <w:r>
-        <w:t xml:space="preserve">Diep.io (2016), </w:t>
-      </w:r>
-      <w:r>
-        <w:t xml:space="preserve">Upgrades Skills </w:t>
-      </w:r>
-    </w:p>
-    <w:p>
-      <w:r>
-        <w:t xml:space="preserve">Like most games in survival upgrades are an important aspect to progression and survival of the player. </w:t>
-      </w:r>
-      <w:r>
-        <w:t xml:space="preserve">Players must obtain exp points from defeating objects each level increase giving upgrade the points the player must use to increase their power, as the player increases in level these are harder to obtain. </w:t>
-      </w:r>
-    </w:p>
-    <w:p>
-      <w:pPr>
-        <w:pStyle w:val="Heading2"/>
+        <w:rPr>
+          <w:sz w:val="22"/>
+          <w:szCs w:val="22"/>
+        </w:rPr>
       </w:pPr>
       <w:r>
         <w:rPr>
           <w:noProof/>
+          <w:sz w:val="22"/>
+          <w:szCs w:val="22"/>
         </w:rPr>
         <w:drawing>
           <wp:inline distT="0" distB="0" distL="0" distR="0" wp14:anchorId="565419AE" wp14:editId="4217AA2E">
@@ -1215,7 +1188,7 @@
     </w:p>
     <w:p>
       <w:pPr>
-        <w:pStyle w:val="Heading2"/>
+        <w:pStyle w:val="Heading3"/>
       </w:pPr>
       <w:r>
         <w:t xml:space="preserve">2.3 </w:t>
@@ -1228,28 +1201,53 @@
       </w:r>
     </w:p>
     <w:p>
-      <w:r>
+      <w:pPr>
+        <w:rPr>
+          <w:sz w:val="22"/>
+          <w:szCs w:val="22"/>
+        </w:rPr>
+      </w:pPr>
+      <w:r>
+        <w:rPr>
+          <w:sz w:val="22"/>
+          <w:szCs w:val="22"/>
+        </w:rPr>
         <w:t>The innovation from abilities comes from Hollow Knights unique approach to aid player the player in defeating enemies and thus improve survival, this only being unlocked at certain stages of the story as well as requiring the player to careful use of their stamina which these abilities require</w:t>
       </w:r>
       <w:r>
+        <w:rPr>
+          <w:sz w:val="22"/>
+          <w:szCs w:val="22"/>
+        </w:rPr>
         <w:t xml:space="preserve"> usage </w:t>
       </w:r>
-      <w:proofErr w:type="spellStart"/>
-      <w:r>
+      <w:r>
+        <w:rPr>
+          <w:sz w:val="22"/>
+          <w:szCs w:val="22"/>
+        </w:rPr>
         <w:t>of</w:t>
       </w:r>
       <w:r>
-        <w:t>s</w:t>
-      </w:r>
-      <w:proofErr w:type="spellEnd"/>
-      <w:r>
+        <w:rPr>
+          <w:sz w:val="22"/>
+          <w:szCs w:val="22"/>
+        </w:rPr>
         <w:t xml:space="preserve">. </w:t>
       </w:r>
     </w:p>
     <w:p>
+      <w:pPr>
+        <w:rPr>
+          <w:sz w:val="22"/>
+          <w:szCs w:val="22"/>
+        </w:rPr>
+      </w:pPr>
       <w:r>
         <w:rPr>
           <w:noProof/>
+          <w:sz w:val="22"/>
+          <w:szCs w:val="22"/>
         </w:rPr>
         <w:drawing>
           <wp:inline distT="0" distB="0" distL="0" distR="0" wp14:anchorId="06E82488" wp14:editId="47B5860C">
@@ -1303,30 +1301,60 @@
     </w:p>
     <w:p>
       <w:pPr>
-        <w:pStyle w:val="Heading2"/>
+        <w:pStyle w:val="Heading3"/>
       </w:pPr>
       <w:r>
         <w:t xml:space="preserve">2.4 Ace Attorney (2001), Story Portrayal </w:t>
       </w:r>
     </w:p>
     <w:p>
-      <w:r>
+      <w:pPr>
+        <w:rPr>
+          <w:sz w:val="22"/>
+          <w:szCs w:val="22"/>
+        </w:rPr>
+      </w:pPr>
+      <w:r>
+        <w:rPr>
+          <w:sz w:val="22"/>
+          <w:szCs w:val="22"/>
+        </w:rPr>
         <w:t xml:space="preserve">Representation of the player dialogue was inspired from visual novel aspect </w:t>
       </w:r>
       <w:r>
+        <w:rPr>
+          <w:sz w:val="22"/>
+          <w:szCs w:val="22"/>
+        </w:rPr>
         <w:t>games such</w:t>
       </w:r>
       <w:r>
+        <w:rPr>
+          <w:sz w:val="22"/>
+          <w:szCs w:val="22"/>
+        </w:rPr>
         <w:t xml:space="preserve"> Ace Attorney where the character where a dialogue box is clear for the player to see and interact with to progress through the story. </w:t>
       </w:r>
       <w:r>
+        <w:rPr>
+          <w:sz w:val="22"/>
+          <w:szCs w:val="22"/>
+        </w:rPr>
         <w:t xml:space="preserve"> Making a simpler representation for the story rather than animating a full cutscene. </w:t>
       </w:r>
     </w:p>
     <w:p>
+      <w:pPr>
+        <w:rPr>
+          <w:sz w:val="22"/>
+          <w:szCs w:val="22"/>
+        </w:rPr>
+      </w:pPr>
       <w:r>
         <w:rPr>
           <w:noProof/>
+          <w:sz w:val="22"/>
+          <w:szCs w:val="22"/>
         </w:rPr>
         <w:lastRenderedPageBreak/>
         <w:drawing>
@@ -1378,49 +1406,66 @@
     </w:p>
     <w:p>
       <w:pPr>
-        <w:pStyle w:val="Heading1"/>
-        <w:jc w:val="both"/>
+        <w:pStyle w:val="Heading2"/>
+      </w:pPr>
+      <w:r>
+        <w:t xml:space="preserve">3. Specification </w:t>
+      </w:r>
+    </w:p>
+    <w:p>
+      <w:pPr>
+        <w:pStyle w:val="Heading3"/>
+      </w:pPr>
+      <w:r>
+        <w:t xml:space="preserve">3.1 Game Story </w:t>
+      </w:r>
+    </w:p>
+    <w:p>
+      <w:pPr>
+        <w:rPr>
+          <w:sz w:val="22"/>
+          <w:szCs w:val="22"/>
+        </w:rPr>
+      </w:pPr>
+      <w:r>
         <w:rPr>
           <w:rFonts w:ascii="Arial" w:hAnsi="Arial" w:cs="Arial"/>
-          <w:sz w:val="28"/>
-          <w:szCs w:val="28"/>
-        </w:rPr>
-      </w:pPr>
+          <w:sz w:val="22"/>
+          <w:szCs w:val="22"/>
+        </w:rPr>
+        <w:t xml:space="preserve">You are a </w:t>
+      </w:r>
       <w:r>
         <w:rPr>
           <w:rFonts w:ascii="Arial" w:hAnsi="Arial" w:cs="Arial"/>
-          <w:sz w:val="28"/>
-          <w:szCs w:val="28"/>
-        </w:rPr>
-        <w:t xml:space="preserve">3. Specification </w:t>
-      </w:r>
-    </w:p>
-    <w:p>
-      <w:pPr>
-        <w:pStyle w:val="Heading2"/>
+          <w:sz w:val="22"/>
+          <w:szCs w:val="22"/>
+        </w:rPr>
+        <w:t>s</w:t>
+      </w:r>
+      <w:r>
         <w:rPr>
           <w:rFonts w:ascii="Arial" w:hAnsi="Arial" w:cs="Arial"/>
-          <w:sz w:val="28"/>
-          <w:szCs w:val="28"/>
-        </w:rPr>
-      </w:pPr>
+          <w:sz w:val="22"/>
+          <w:szCs w:val="22"/>
+        </w:rPr>
+        <w:t xml:space="preserve">lime going on a journey to the promised </w:t>
+      </w:r>
       <w:r>
         <w:rPr>
           <w:rFonts w:ascii="Arial" w:hAnsi="Arial" w:cs="Arial"/>
-          <w:sz w:val="28"/>
-          <w:szCs w:val="28"/>
-        </w:rPr>
-        <w:t xml:space="preserve">3.1 Game Story </w:t>
-      </w:r>
-    </w:p>
-    <w:p>
+          <w:sz w:val="22"/>
+          <w:szCs w:val="22"/>
+        </w:rPr>
+        <w:t xml:space="preserve">great </w:t>
+      </w:r>
       <w:r>
         <w:rPr>
           <w:rFonts w:ascii="Arial" w:hAnsi="Arial" w:cs="Arial"/>
           <w:sz w:val="22"/>
           <w:szCs w:val="22"/>
         </w:rPr>
-        <w:t xml:space="preserve">You are a </w:t>
+        <w:t>slime kingdom, but the journey will be tough you will pass through many terrains, different encounters</w:t>
       </w:r>
       <w:r>
         <w:rPr>
@@ -1428,7 +1473,7 @@
           <w:sz w:val="22"/>
           <w:szCs w:val="22"/>
         </w:rPr>
-        <w:t>s</w:t>
+        <w:t>,</w:t>
       </w:r>
       <w:r>
         <w:rPr>
@@ -1436,7 +1481,7 @@
           <w:sz w:val="22"/>
           <w:szCs w:val="22"/>
         </w:rPr>
-        <w:t xml:space="preserve">lime going on a journey to the promised </w:t>
+        <w:t xml:space="preserve"> can you survive and make it to the end?</w:t>
       </w:r>
       <w:r>
         <w:rPr>
@@ -1444,7 +1489,7 @@
           <w:sz w:val="22"/>
           <w:szCs w:val="22"/>
         </w:rPr>
-        <w:t xml:space="preserve">great </w:t>
+        <w:t>`</w:t>
       </w:r>
       <w:r>
         <w:rPr>
@@ -1452,262 +1497,393 @@
           <w:sz w:val="22"/>
           <w:szCs w:val="22"/>
         </w:rPr>
-        <w:t>slime kingdom, but the journey will be tough you will pass through many terrains, different encounters</w:t>
-      </w:r>
-      <w:r>
-        <w:rPr>
-          <w:rFonts w:ascii="Arial" w:hAnsi="Arial" w:cs="Arial"/>
-          <w:sz w:val="22"/>
-          <w:szCs w:val="22"/>
-        </w:rPr>
-        <w:t>,</w:t>
-      </w:r>
-      <w:r>
-        <w:rPr>
-          <w:rFonts w:ascii="Arial" w:hAnsi="Arial" w:cs="Arial"/>
-          <w:sz w:val="22"/>
-          <w:szCs w:val="22"/>
-        </w:rPr>
-        <w:t xml:space="preserve"> can you survive and make it to the end?</w:t>
-      </w:r>
-      <w:r>
-        <w:rPr>
-          <w:rFonts w:ascii="Arial" w:hAnsi="Arial" w:cs="Arial"/>
-          <w:sz w:val="22"/>
-          <w:szCs w:val="22"/>
-        </w:rPr>
-        <w:t>`</w:t>
-      </w:r>
-      <w:r>
-        <w:rPr>
-          <w:rFonts w:ascii="Arial" w:hAnsi="Arial" w:cs="Arial"/>
-          <w:sz w:val="22"/>
-          <w:szCs w:val="22"/>
-        </w:rPr>
         <w:t xml:space="preserve"> </w:t>
       </w:r>
     </w:p>
     <w:p>
       <w:pPr>
-        <w:pStyle w:val="Heading3"/>
-        <w:rPr>
-          <w:rFonts w:ascii="Arial" w:hAnsi="Arial" w:cs="Arial"/>
-        </w:rPr>
+        <w:pStyle w:val="Heading4"/>
       </w:pPr>
       <w:bookmarkStart w:id="0" w:name="_3.1.1_Player_Story"/>
       <w:bookmarkEnd w:id="0"/>
       <w:r>
+        <w:t>3.</w:t>
+      </w:r>
+      <w:r>
+        <w:t xml:space="preserve">1.1 </w:t>
+      </w:r>
+      <w:r>
+        <w:t xml:space="preserve">Player Story </w:t>
+      </w:r>
+    </w:p>
+    <w:p>
+      <w:pPr>
         <w:rPr>
           <w:rFonts w:ascii="Arial" w:hAnsi="Arial" w:cs="Arial"/>
-        </w:rPr>
-        <w:t>3.</w:t>
-      </w:r>
+          <w:sz w:val="22"/>
+          <w:szCs w:val="22"/>
+        </w:rPr>
+      </w:pPr>
       <w:r>
         <w:rPr>
           <w:rFonts w:ascii="Arial" w:hAnsi="Arial" w:cs="Arial"/>
-        </w:rPr>
-        <w:t xml:space="preserve">1.1 </w:t>
+          <w:sz w:val="22"/>
+          <w:szCs w:val="22"/>
+        </w:rPr>
+        <w:t xml:space="preserve">You </w:t>
       </w:r>
       <w:r>
         <w:rPr>
           <w:rFonts w:ascii="Arial" w:hAnsi="Arial" w:cs="Arial"/>
-        </w:rPr>
-        <w:t xml:space="preserve">Player Story </w:t>
-      </w:r>
-    </w:p>
-    <w:p>
-      <w:pPr>
+          <w:sz w:val="22"/>
+          <w:szCs w:val="22"/>
+        </w:rPr>
+        <w:t xml:space="preserve">are just a slime, an ordinary slime, but rumours of the promised Slime kingdom emerge think about it - the fame, glory and most of all a better life why wouldn’t you not take it. The game begins at the start of the journey the forest.  </w:t>
+      </w:r>
+      <w:r>
         <w:rPr>
           <w:rFonts w:ascii="Arial" w:hAnsi="Arial" w:cs="Arial"/>
           <w:sz w:val="22"/>
           <w:szCs w:val="22"/>
         </w:rPr>
-      </w:pPr>
-      <w:r>
-        <w:rPr>
-          <w:rFonts w:ascii="Arial" w:hAnsi="Arial" w:cs="Arial"/>
-          <w:sz w:val="22"/>
-          <w:szCs w:val="22"/>
-        </w:rPr>
-        <w:t xml:space="preserve">You </w:t>
-      </w:r>
-      <w:r>
-        <w:rPr>
-          <w:rFonts w:ascii="Arial" w:hAnsi="Arial" w:cs="Arial"/>
-          <w:sz w:val="22"/>
-          <w:szCs w:val="22"/>
-        </w:rPr>
-        <w:t xml:space="preserve">are just a slime, an ordinary slime, but rumours of the promised Slime kingdom emerge think about it - the fame, glory and most of all a better life why wouldn’t you not take it. The game begins at the start of the journey the forest.  </w:t>
-      </w:r>
-      <w:r>
-        <w:rPr>
-          <w:rFonts w:ascii="Arial" w:hAnsi="Arial" w:cs="Arial"/>
-          <w:sz w:val="22"/>
-          <w:szCs w:val="22"/>
-        </w:rPr>
         <w:t xml:space="preserve"> </w:t>
       </w:r>
     </w:p>
     <w:p>
       <w:pPr>
+        <w:pStyle w:val="Heading4"/>
+      </w:pPr>
+      <w:r>
+        <w:t xml:space="preserve">3.1.2 General Story </w:t>
+      </w:r>
+    </w:p>
+    <w:p>
+      <w:pPr>
+        <w:rPr>
+          <w:sz w:val="22"/>
+          <w:szCs w:val="22"/>
+        </w:rPr>
+      </w:pPr>
+      <w:r>
+        <w:rPr>
+          <w:sz w:val="22"/>
+          <w:szCs w:val="22"/>
+        </w:rPr>
+        <w:t xml:space="preserve">The game begins at the point of the characters travel, </w:t>
+      </w:r>
+      <w:r>
+        <w:rPr>
+          <w:sz w:val="22"/>
+          <w:szCs w:val="22"/>
+        </w:rPr>
+        <w:t xml:space="preserve">where </w:t>
+      </w:r>
+      <w:r>
+        <w:rPr>
+          <w:sz w:val="22"/>
+          <w:szCs w:val="22"/>
+        </w:rPr>
+        <w:t xml:space="preserve">each few waves of enemies having a different terrain </w:t>
+      </w:r>
+      <w:r>
+        <w:rPr>
+          <w:sz w:val="22"/>
+          <w:szCs w:val="22"/>
+        </w:rPr>
+        <w:t>reflecting</w:t>
+      </w:r>
+      <w:r>
+        <w:rPr>
+          <w:sz w:val="22"/>
+          <w:szCs w:val="22"/>
+        </w:rPr>
+        <w:t xml:space="preserve"> on the enemy and</w:t>
+      </w:r>
+      <w:r>
+        <w:rPr>
+          <w:sz w:val="22"/>
+          <w:szCs w:val="22"/>
+        </w:rPr>
+        <w:t xml:space="preserve"> the different points the player is at </w:t>
+      </w:r>
+      <w:r>
+        <w:rPr>
+          <w:sz w:val="22"/>
+          <w:szCs w:val="22"/>
+        </w:rPr>
+        <w:t>within</w:t>
+      </w:r>
+      <w:r>
+        <w:rPr>
+          <w:sz w:val="22"/>
+          <w:szCs w:val="22"/>
+        </w:rPr>
+        <w:t xml:space="preserve"> the story.</w:t>
+      </w:r>
+    </w:p>
+    <w:p>
+      <w:pPr>
         <w:pStyle w:val="Heading3"/>
-        <w:rPr>
-          <w:rFonts w:ascii="Arial" w:hAnsi="Arial" w:cs="Arial"/>
-        </w:rPr>
-      </w:pPr>
-      <w:r>
-        <w:rPr>
-          <w:rFonts w:ascii="Arial" w:hAnsi="Arial" w:cs="Arial"/>
-        </w:rPr>
-        <w:t>3.1</w:t>
-      </w:r>
-      <w:r>
-        <w:rPr>
-          <w:rFonts w:ascii="Arial" w:hAnsi="Arial" w:cs="Arial"/>
-        </w:rPr>
-        <w:t xml:space="preserve">.2 General Story </w:t>
-      </w:r>
-    </w:p>
-    <w:p>
-      <w:r>
-        <w:t xml:space="preserve">The game begins at the point of the characters travel, </w:t>
-      </w:r>
-      <w:r>
-        <w:t xml:space="preserve">where </w:t>
-      </w:r>
-      <w:r>
-        <w:t xml:space="preserve">each few waves of enemies having a different terrain </w:t>
-      </w:r>
-      <w:r>
-        <w:t>reflecting</w:t>
-      </w:r>
-      <w:r>
-        <w:t xml:space="preserve"> on the enemy and</w:t>
-      </w:r>
-      <w:r>
-        <w:t xml:space="preserve"> the different points the player is at </w:t>
-      </w:r>
-      <w:r>
-        <w:t>within</w:t>
-      </w:r>
-      <w:r>
-        <w:t xml:space="preserve"> the story.</w:t>
-      </w:r>
-    </w:p>
-    <w:p>
-      <w:r>
-        <w:t>You have lived</w:t>
-      </w:r>
-      <w:r>
-        <w:t xml:space="preserve"> your whole life in your hometown sure everyday is fine and dandy but you want more than just walking aimlessly all day doing nothing but then a rumour emerges in your village, there is a place, a promised land for the better but to get there you need to go on a dangerous journey to the Kingdom. In hopes for adventure and a better life you decide its time. </w:t>
-      </w:r>
-      <w:r>
+      </w:pPr>
+      <w:r>
+        <w:t xml:space="preserve">3.2 Game Aesthetics </w:t>
+      </w:r>
+    </w:p>
+    <w:p>
+      <w:pPr>
+        <w:rPr>
+          <w:sz w:val="22"/>
+          <w:szCs w:val="22"/>
+        </w:rPr>
+      </w:pPr>
+      <w:r>
+        <w:rPr>
+          <w:sz w:val="22"/>
+          <w:szCs w:val="22"/>
+        </w:rPr>
+        <w:t xml:space="preserve">The aesthetics of this game will be </w:t>
+      </w:r>
+      <w:r>
+        <w:rPr>
+          <w:sz w:val="22"/>
+          <w:szCs w:val="22"/>
+        </w:rPr>
+        <w:t xml:space="preserve">mostly </w:t>
+      </w:r>
+      <w:r>
+        <w:rPr>
+          <w:sz w:val="22"/>
+          <w:szCs w:val="22"/>
+        </w:rPr>
+        <w:t xml:space="preserve">simple and stylised, using bright colours and a </w:t>
+      </w:r>
+      <w:r>
+        <w:rPr>
+          <w:sz w:val="22"/>
+          <w:szCs w:val="22"/>
+        </w:rPr>
+        <w:t xml:space="preserve">detail to the environment for a more immersive </w:t>
+      </w:r>
+      <w:r>
+        <w:rPr>
+          <w:sz w:val="22"/>
+          <w:szCs w:val="22"/>
+        </w:rPr>
+        <w:t>experience</w:t>
+      </w:r>
+      <w:r>
+        <w:rPr>
+          <w:sz w:val="22"/>
+          <w:szCs w:val="22"/>
+        </w:rPr>
+        <w:t>, this is done via</w:t>
+      </w:r>
+      <w:r>
+        <w:rPr>
+          <w:sz w:val="22"/>
+          <w:szCs w:val="22"/>
+        </w:rPr>
         <w:t xml:space="preserve"> </w:t>
       </w:r>
-    </w:p>
-    <w:p>
-      <w:pPr>
-        <w:pStyle w:val="Heading2"/>
-      </w:pPr>
-      <w:r>
-        <w:t xml:space="preserve">3.2 Game Aesthetics </w:t>
-      </w:r>
-    </w:p>
-    <w:p>
-      <w:r>
-        <w:t xml:space="preserve">The aesthetics of this game will be </w:t>
-      </w:r>
-      <w:r>
-        <w:t xml:space="preserve">mostly </w:t>
-      </w:r>
-      <w:r>
-        <w:t xml:space="preserve">simple and stylised, using bright colours and a </w:t>
-      </w:r>
-      <w:r>
-        <w:t>detail to the environment for a more immersive experience</w:t>
-      </w:r>
-      <w:r>
-        <w:t>. The visuals will</w:t>
-      </w:r>
-      <w:r>
+      <w:r>
+        <w:rPr>
+          <w:sz w:val="22"/>
+          <w:szCs w:val="22"/>
+        </w:rPr>
+        <w:t>t</w:t>
+      </w:r>
+      <w:r>
+        <w:rPr>
+          <w:sz w:val="22"/>
+          <w:szCs w:val="22"/>
+        </w:rPr>
+        <w:t>he visuals</w:t>
+      </w:r>
+      <w:r>
+        <w:rPr>
+          <w:sz w:val="22"/>
+          <w:szCs w:val="22"/>
+        </w:rPr>
+        <w:t xml:space="preserve">, which </w:t>
+      </w:r>
+      <w:r>
+        <w:rPr>
+          <w:sz w:val="22"/>
+          <w:szCs w:val="22"/>
+        </w:rPr>
+        <w:t xml:space="preserve"> will</w:t>
+      </w:r>
+      <w:r>
+        <w:rPr>
+          <w:sz w:val="22"/>
+          <w:szCs w:val="22"/>
+        </w:rPr>
         <w:t xml:space="preserve"> have some </w:t>
       </w:r>
       <w:r>
+        <w:rPr>
+          <w:sz w:val="22"/>
+          <w:szCs w:val="22"/>
+        </w:rPr>
+        <w:t xml:space="preserve">level of </w:t>
+      </w:r>
+      <w:r>
+        <w:rPr>
+          <w:sz w:val="22"/>
+          <w:szCs w:val="22"/>
+        </w:rPr>
         <w:t xml:space="preserve">realism </w:t>
       </w:r>
       <w:r>
+        <w:rPr>
+          <w:sz w:val="22"/>
+          <w:szCs w:val="22"/>
+        </w:rPr>
         <w:t>via some physics to the slime as well as some possible environmental effects like grass movement.</w:t>
       </w:r>
     </w:p>
     <w:p>
-      <w:r>
+      <w:pPr>
+        <w:rPr>
+          <w:sz w:val="22"/>
+          <w:szCs w:val="22"/>
+        </w:rPr>
+      </w:pPr>
+      <w:r>
+        <w:rPr>
+          <w:sz w:val="22"/>
+          <w:szCs w:val="22"/>
+        </w:rPr>
         <w:t xml:space="preserve">This approach is chosen to keep the art style </w:t>
       </w:r>
       <w:r>
+        <w:rPr>
+          <w:sz w:val="22"/>
+          <w:szCs w:val="22"/>
+        </w:rPr>
         <w:t>visually appealing</w:t>
       </w:r>
       <w:r>
+        <w:rPr>
+          <w:sz w:val="22"/>
+          <w:szCs w:val="22"/>
+        </w:rPr>
         <w:t xml:space="preserve"> </w:t>
       </w:r>
       <w:r>
+        <w:rPr>
+          <w:sz w:val="22"/>
+          <w:szCs w:val="22"/>
+        </w:rPr>
         <w:t xml:space="preserve"> for players</w:t>
       </w:r>
       <w:r>
+        <w:rPr>
+          <w:sz w:val="22"/>
+          <w:szCs w:val="22"/>
+        </w:rPr>
         <w:t xml:space="preserve"> to visualise</w:t>
       </w:r>
       <w:r>
+        <w:rPr>
+          <w:sz w:val="22"/>
+          <w:szCs w:val="22"/>
+        </w:rPr>
         <w:t xml:space="preserve"> and immerse themselves in the world </w:t>
       </w:r>
       <w:r>
+        <w:rPr>
+          <w:sz w:val="22"/>
+          <w:szCs w:val="22"/>
+        </w:rPr>
         <w:t xml:space="preserve"> </w:t>
       </w:r>
       <w:r>
+        <w:rPr>
+          <w:sz w:val="22"/>
+          <w:szCs w:val="22"/>
+        </w:rPr>
         <w:t>whilst some models may be kept simple to make the game not too performance intensive</w:t>
       </w:r>
       <w:r>
+        <w:rPr>
+          <w:sz w:val="22"/>
+          <w:szCs w:val="22"/>
+        </w:rPr>
         <w:t xml:space="preserve">. </w:t>
       </w:r>
       <w:r>
+        <w:rPr>
+          <w:sz w:val="22"/>
+          <w:szCs w:val="22"/>
+        </w:rPr>
         <w:t>Most a</w:t>
       </w:r>
       <w:r>
+        <w:rPr>
+          <w:sz w:val="22"/>
+          <w:szCs w:val="22"/>
+        </w:rPr>
         <w:t xml:space="preserve">ssets added </w:t>
       </w:r>
       <w:r>
+        <w:rPr>
+          <w:sz w:val="22"/>
+          <w:szCs w:val="22"/>
+        </w:rPr>
         <w:t>will</w:t>
       </w:r>
       <w:r>
+        <w:rPr>
+          <w:sz w:val="22"/>
+          <w:szCs w:val="22"/>
+        </w:rPr>
         <w:t xml:space="preserve"> follow the same colourful style to maintain a cohesive visual identity across the game.</w:t>
       </w:r>
     </w:p>
     <w:p>
       <w:pPr>
-        <w:pStyle w:val="Heading2"/>
-      </w:pPr>
-      <w:r>
-        <w:lastRenderedPageBreak/>
+        <w:pStyle w:val="Heading3"/>
+      </w:pPr>
+      <w:r>
         <w:t>3.3 Game Characters</w:t>
       </w:r>
     </w:p>
     <w:p>
       <w:pPr>
-        <w:pStyle w:val="Heading3"/>
+        <w:pStyle w:val="Heading4"/>
       </w:pPr>
       <w:r>
         <w:t xml:space="preserve">3.3.1 Slime </w:t>
       </w:r>
     </w:p>
     <w:p>
-      <w:r>
+      <w:pPr>
+        <w:rPr>
+          <w:sz w:val="22"/>
+          <w:szCs w:val="22"/>
+        </w:rPr>
+      </w:pPr>
+      <w:r>
+        <w:rPr>
+          <w:sz w:val="22"/>
+          <w:szCs w:val="22"/>
+        </w:rPr>
         <w:t>The player</w:t>
       </w:r>
       <w:r>
+        <w:rPr>
+          <w:sz w:val="22"/>
+          <w:szCs w:val="22"/>
+        </w:rPr>
         <w:t xml:space="preserve">, being a slime. Player Story in </w:t>
       </w:r>
       <w:hyperlink w:anchor="_3.1.1_Player_Story" w:history="1">
         <w:r>
           <w:rPr>
             <w:rStyle w:val="Hyperlink"/>
+            <w:sz w:val="22"/>
+            <w:szCs w:val="22"/>
           </w:rPr>
           <w:t>Section 3.11</w:t>
         </w:r>
@@ -1715,41 +1891,90 @@
     </w:p>
     <w:p>
       <w:pPr>
-        <w:pStyle w:val="Heading3"/>
+        <w:pStyle w:val="Heading4"/>
       </w:pPr>
       <w:r>
         <w:t>3.3.2 Enemies</w:t>
       </w:r>
     </w:p>
     <w:p>
-      <w:r>
-        <w:t>Each terrain the player is in will have different enemies or a mixture of combined enemies reflecting the current point of the story the player is in, and enemies will have the same mechanics to another – finding and killing the player.</w:t>
-      </w:r>
-    </w:p>
-    <w:p>
-      <w:pPr>
-        <w:pStyle w:val="Heading2"/>
-      </w:pPr>
-      <w:r>
+      <w:pPr>
+        <w:rPr>
+          <w:sz w:val="22"/>
+          <w:szCs w:val="22"/>
+        </w:rPr>
+      </w:pPr>
+      <w:r>
+        <w:rPr>
+          <w:sz w:val="22"/>
+          <w:szCs w:val="22"/>
+        </w:rPr>
+        <w:t xml:space="preserve">Each terrain the player is in will have different enemies or a mixture of combined enemies reflecting the current point of the story the player is in, and </w:t>
+      </w:r>
+      <w:r>
+        <w:rPr>
+          <w:sz w:val="22"/>
+          <w:szCs w:val="22"/>
+        </w:rPr>
+        <w:t xml:space="preserve">all </w:t>
+      </w:r>
+      <w:r>
+        <w:rPr>
+          <w:sz w:val="22"/>
+          <w:szCs w:val="22"/>
+        </w:rPr>
+        <w:t>enemies will have the same mechanics to another – finding and killing the player.</w:t>
+      </w:r>
+    </w:p>
+    <w:p>
+      <w:pPr>
+        <w:pStyle w:val="Heading4"/>
+      </w:pPr>
+      <w:r>
+        <w:lastRenderedPageBreak/>
         <w:t xml:space="preserve">3.4 Game Content </w:t>
       </w:r>
     </w:p>
     <w:p>
-      <w:r>
+      <w:pPr>
+        <w:rPr>
+          <w:sz w:val="22"/>
+          <w:szCs w:val="22"/>
+        </w:rPr>
+      </w:pPr>
+      <w:r>
+        <w:rPr>
+          <w:sz w:val="22"/>
+          <w:szCs w:val="22"/>
+        </w:rPr>
         <w:t xml:space="preserve">Each level will have a set number of waves, this will generate groups of enemies and will progressively get harder as the story progresses. Starting levels will take around 5 mins to complete whilst levels further into the game will take longer to around 20-30mins. </w:t>
       </w:r>
     </w:p>
     <w:p>
-      <w:r>
+      <w:pPr>
+        <w:rPr>
+          <w:sz w:val="22"/>
+          <w:szCs w:val="22"/>
+        </w:rPr>
+      </w:pPr>
+      <w:r>
+        <w:rPr>
+          <w:sz w:val="22"/>
+          <w:szCs w:val="22"/>
+        </w:rPr>
         <w:t>Some of these levels may include:</w:t>
       </w:r>
       <w:r>
+        <w:rPr>
+          <w:sz w:val="22"/>
+          <w:szCs w:val="22"/>
+        </w:rPr>
         <w:t xml:space="preserve">  </w:t>
       </w:r>
     </w:p>
     <w:p>
       <w:pPr>
-        <w:pStyle w:val="Heading3"/>
+        <w:pStyle w:val="Heading4"/>
       </w:pPr>
       <w:r>
         <w:t xml:space="preserve">3.4.1 </w:t>
@@ -1763,14 +1988,33 @@
         <w:rPr>
           <w:b/>
           <w:bCs/>
+          <w:sz w:val="22"/>
+          <w:szCs w:val="22"/>
         </w:rPr>
       </w:pPr>
       <w:r>
         <w:rPr>
           <w:b/>
           <w:bCs/>
+          <w:sz w:val="22"/>
+          <w:szCs w:val="22"/>
         </w:rPr>
         <w:t>Story</w:t>
+      </w:r>
+    </w:p>
+    <w:p>
+      <w:pPr>
+        <w:rPr>
+          <w:sz w:val="22"/>
+          <w:szCs w:val="22"/>
+        </w:rPr>
+      </w:pPr>
+      <w:r>
+        <w:rPr>
+          <w:sz w:val="22"/>
+          <w:szCs w:val="22"/>
+        </w:rPr>
+        <w:t>A gang of goblins block your path through the forest, their weapons raised and their intentions clear. They have claimed this stretch of woodland as their own, and they won’t let anyone pass unchallenged. If you want to move forward, you’ll have to fight your way through.</w:t>
       </w:r>
     </w:p>
     <w:p>
@@ -1778,19 +2022,59 @@
         <w:rPr>
           <w:b/>
           <w:bCs/>
+          <w:sz w:val="22"/>
+          <w:szCs w:val="22"/>
         </w:rPr>
       </w:pPr>
       <w:r>
         <w:rPr>
           <w:b/>
           <w:bCs/>
+          <w:sz w:val="22"/>
+          <w:szCs w:val="22"/>
         </w:rPr>
         <w:t>Gameplay</w:t>
       </w:r>
     </w:p>
     <w:p>
       <w:pPr>
-        <w:pStyle w:val="Heading3"/>
+        <w:rPr>
+          <w:sz w:val="22"/>
+          <w:szCs w:val="22"/>
+        </w:rPr>
+      </w:pPr>
+      <w:r>
+        <w:rPr>
+          <w:sz w:val="22"/>
+          <w:szCs w:val="22"/>
+        </w:rPr>
+        <w:t>In this forest clearing, the player encounters a hostile group of goblins that initiate a wave-based combat scenario</w:t>
+      </w:r>
+      <w:r>
+        <w:rPr>
+          <w:sz w:val="22"/>
+          <w:szCs w:val="22"/>
+        </w:rPr>
+        <w:t>, t</w:t>
+      </w:r>
+      <w:r>
+        <w:rPr>
+          <w:sz w:val="22"/>
+          <w:szCs w:val="22"/>
+        </w:rPr>
+        <w:t xml:space="preserve">he player must manage positioning, stamina and </w:t>
+      </w:r>
+      <w:r>
+        <w:rPr>
+          <w:sz w:val="22"/>
+          <w:szCs w:val="22"/>
+        </w:rPr>
+        <w:t xml:space="preserve">skills to make it through this level , they must make sure to beat all the waves without dying to complete the level successfully . The terrain can aid the player where there are clear spots for high ground or put the player in a disadvantage setting up ambushes from the goblins,  it’s their territory after all. </w:t>
+      </w:r>
+    </w:p>
+    <w:p>
+      <w:pPr>
+        <w:pStyle w:val="Heading4"/>
       </w:pPr>
       <w:r>
         <w:t>3.4.</w:t>
@@ -1810,14 +2094,187 @@
         <w:rPr>
           <w:b/>
           <w:bCs/>
+          <w:sz w:val="22"/>
+          <w:szCs w:val="22"/>
         </w:rPr>
       </w:pPr>
       <w:r>
         <w:rPr>
           <w:b/>
           <w:bCs/>
+          <w:sz w:val="22"/>
+          <w:szCs w:val="22"/>
         </w:rPr>
         <w:t>Story</w:t>
+      </w:r>
+    </w:p>
+    <w:p>
+      <w:pPr>
+        <w:rPr>
+          <w:sz w:val="22"/>
+          <w:szCs w:val="22"/>
+        </w:rPr>
+      </w:pPr>
+      <w:r>
+        <w:rPr>
+          <w:sz w:val="22"/>
+          <w:szCs w:val="22"/>
+        </w:rPr>
+        <w:t>Beyond the forest</w:t>
+      </w:r>
+      <w:r>
+        <w:rPr>
+          <w:sz w:val="22"/>
+          <w:szCs w:val="22"/>
+        </w:rPr>
+        <w:t xml:space="preserve"> </w:t>
+      </w:r>
+      <w:r>
+        <w:rPr>
+          <w:sz w:val="22"/>
+          <w:szCs w:val="22"/>
+        </w:rPr>
+        <w:t xml:space="preserve"> lies a thick, mist-covered swamp where </w:t>
+      </w:r>
+      <w:r>
+        <w:rPr>
+          <w:sz w:val="22"/>
+          <w:szCs w:val="22"/>
+        </w:rPr>
+        <w:t>anything moving is a threat</w:t>
+      </w:r>
+      <w:r>
+        <w:rPr>
+          <w:sz w:val="22"/>
+          <w:szCs w:val="22"/>
+        </w:rPr>
+        <w:t xml:space="preserve"> as you make your way forward </w:t>
+      </w:r>
+      <w:r>
+        <w:rPr>
+          <w:sz w:val="22"/>
+          <w:szCs w:val="22"/>
+        </w:rPr>
+        <w:t>and</w:t>
+      </w:r>
+      <w:r>
+        <w:rPr>
+          <w:sz w:val="22"/>
+          <w:szCs w:val="22"/>
+        </w:rPr>
+        <w:t xml:space="preserve"> seems the </w:t>
+      </w:r>
+      <w:r>
+        <w:rPr>
+          <w:sz w:val="22"/>
+          <w:szCs w:val="22"/>
+        </w:rPr>
+        <w:t>local</w:t>
+      </w:r>
+      <w:r>
+        <w:rPr>
+          <w:sz w:val="22"/>
+          <w:szCs w:val="22"/>
+        </w:rPr>
+        <w:t>s</w:t>
+      </w:r>
+      <w:r>
+        <w:rPr>
+          <w:sz w:val="22"/>
+          <w:szCs w:val="22"/>
+        </w:rPr>
+        <w:t xml:space="preserve"> </w:t>
+      </w:r>
+      <w:r>
+        <w:rPr>
+          <w:sz w:val="22"/>
+          <w:szCs w:val="22"/>
+        </w:rPr>
+        <w:t>don’t quite like you</w:t>
+      </w:r>
+      <w:r>
+        <w:rPr>
+          <w:sz w:val="22"/>
+          <w:szCs w:val="22"/>
+        </w:rPr>
+        <w:t xml:space="preserve">, </w:t>
+      </w:r>
+      <w:r>
+        <w:rPr>
+          <w:sz w:val="22"/>
+          <w:szCs w:val="22"/>
+        </w:rPr>
+        <w:t xml:space="preserve">the swamp will </w:t>
+      </w:r>
+      <w:r>
+        <w:rPr>
+          <w:sz w:val="22"/>
+          <w:szCs w:val="22"/>
+        </w:rPr>
+        <w:t>defend it</w:t>
+      </w:r>
+      <w:r>
+        <w:rPr>
+          <w:sz w:val="22"/>
+          <w:szCs w:val="22"/>
+        </w:rPr>
+        <w:t>self</w:t>
+      </w:r>
+      <w:r>
+        <w:rPr>
+          <w:sz w:val="22"/>
+          <w:szCs w:val="22"/>
+        </w:rPr>
+        <w:t xml:space="preserve"> from intruders</w:t>
+      </w:r>
+      <w:r>
+        <w:rPr>
+          <w:sz w:val="22"/>
+          <w:szCs w:val="22"/>
+        </w:rPr>
+        <w:t xml:space="preserve"> and you seem to be one of them</w:t>
+      </w:r>
+      <w:r>
+        <w:rPr>
+          <w:sz w:val="22"/>
+          <w:szCs w:val="22"/>
+        </w:rPr>
+        <w:t xml:space="preserve">. </w:t>
+      </w:r>
+      <w:r>
+        <w:rPr>
+          <w:sz w:val="22"/>
+          <w:szCs w:val="22"/>
+        </w:rPr>
+        <w:t>I</w:t>
+      </w:r>
+      <w:r>
+        <w:rPr>
+          <w:sz w:val="22"/>
+          <w:szCs w:val="22"/>
+        </w:rPr>
+        <w:t>f you want to pass through</w:t>
+      </w:r>
+      <w:r>
+        <w:rPr>
+          <w:sz w:val="22"/>
+          <w:szCs w:val="22"/>
+        </w:rPr>
+        <w:t xml:space="preserve"> beat the source of the </w:t>
+      </w:r>
+      <w:r>
+        <w:rPr>
+          <w:sz w:val="22"/>
+          <w:szCs w:val="22"/>
+        </w:rPr>
+        <w:t>disruption</w:t>
+      </w:r>
+      <w:r>
+        <w:rPr>
+          <w:sz w:val="22"/>
+          <w:szCs w:val="22"/>
+        </w:rPr>
+        <w:t>.</w:t>
       </w:r>
     </w:p>
     <w:p>
@@ -1825,23 +2282,54 @@
         <w:rPr>
           <w:b/>
           <w:bCs/>
+          <w:sz w:val="22"/>
+          <w:szCs w:val="22"/>
         </w:rPr>
       </w:pPr>
       <w:r>
         <w:rPr>
           <w:b/>
           <w:bCs/>
+          <w:sz w:val="22"/>
+          <w:szCs w:val="22"/>
         </w:rPr>
         <w:t>Gameplay</w:t>
       </w:r>
     </w:p>
     <w:p>
       <w:pPr>
-        <w:pStyle w:val="Heading3"/>
         <w:rPr>
           <w:b/>
           <w:bCs/>
-        </w:rPr>
+          <w:sz w:val="22"/>
+          <w:szCs w:val="22"/>
+        </w:rPr>
+      </w:pPr>
+      <w:r>
+        <w:rPr>
+          <w:sz w:val="22"/>
+          <w:szCs w:val="22"/>
+        </w:rPr>
+        <w:t>P</w:t>
+      </w:r>
+      <w:r>
+        <w:rPr>
+          <w:sz w:val="22"/>
+          <w:szCs w:val="22"/>
+        </w:rPr>
+        <w:t>layers must traverse through the muddy environment slowing them down and providing an opportunity</w:t>
+      </w:r>
+      <w:r>
+        <w:rPr>
+          <w:sz w:val="22"/>
+          <w:szCs w:val="22"/>
+        </w:rPr>
+        <w:t xml:space="preserve"> for the enemies to pounce. The player must aim to kill the group leader enemy of each waves otherwise waves will keep spawning, the player should avoid the muddy terrain paths to avoid being overwhelmed as well as allocated resources to skills to make sure they can eliminate the leader as quickly as possible.</w:t>
+      </w:r>
+    </w:p>
+    <w:p>
+      <w:pPr>
+        <w:pStyle w:val="Heading4"/>
       </w:pPr>
       <w:r>
         <w:t>3.4.</w:t>
@@ -1858,50 +2346,297 @@
     </w:p>
     <w:p>
       <w:pPr>
-        <w:pStyle w:val="Heading1"/>
-        <w:jc w:val="both"/>
-        <w:rPr>
-          <w:rFonts w:ascii="Arial" w:hAnsi="Arial" w:cs="Arial"/>
-          <w:sz w:val="28"/>
-          <w:szCs w:val="28"/>
-        </w:rPr>
-      </w:pPr>
-      <w:r>
-        <w:rPr>
-          <w:rFonts w:ascii="Arial" w:hAnsi="Arial" w:cs="Arial"/>
-          <w:sz w:val="28"/>
-          <w:szCs w:val="28"/>
-        </w:rPr>
+        <w:pStyle w:val="Heading3"/>
+      </w:pPr>
+      <w:r>
+        <w:t>3.5 Game Mechanics</w:t>
+      </w:r>
+    </w:p>
+    <w:p>
+      <w:pPr>
+        <w:pStyle w:val="Heading3"/>
+      </w:pPr>
+      <w:r>
+        <w:t>3.5.1 Movement</w:t>
+      </w:r>
+    </w:p>
+    <w:p>
+      <w:pPr>
+        <w:rPr>
+          <w:b/>
+          <w:bCs/>
+        </w:rPr>
+      </w:pPr>
+      <w:r>
+        <w:rPr>
+          <w:b/>
+          <w:bCs/>
+        </w:rPr>
+        <w:t>WASD</w:t>
+      </w:r>
+      <w:r>
+        <w:t xml:space="preserve"> directional movement </w:t>
+      </w:r>
+      <w:r>
+        <w:t xml:space="preserve">typical in most first-person games. </w:t>
+      </w:r>
+    </w:p>
+    <w:p>
+      <w:pPr>
+        <w:rPr>
+          <w:b/>
+          <w:bCs/>
+        </w:rPr>
+      </w:pPr>
+      <w:r>
+        <w:rPr>
+          <w:b/>
+          <w:bCs/>
+        </w:rPr>
+        <w:t>Dash Mechanic</w:t>
+      </w:r>
+      <w:r>
+        <w:rPr>
+          <w:b/>
+          <w:bCs/>
+        </w:rPr>
+        <w:t xml:space="preserve"> - </w:t>
+      </w:r>
+      <w:r>
+        <w:t>Short burst of directional movement</w:t>
+      </w:r>
+      <w:r>
+        <w:rPr>
+          <w:b/>
+          <w:bCs/>
+        </w:rPr>
+        <w:t xml:space="preserve"> </w:t>
+      </w:r>
+      <w:r>
+        <w:t xml:space="preserve">that </w:t>
+      </w:r>
+      <w:r>
+        <w:t>c</w:t>
+      </w:r>
+      <w:r>
+        <w:t>onsum</w:t>
+      </w:r>
+      <w:r>
+        <w:t>es</w:t>
+      </w:r>
+      <w:r>
+        <w:t xml:space="preserve"> </w:t>
+      </w:r>
+      <w:r>
+        <w:t>s</w:t>
+      </w:r>
+      <w:r>
+        <w:t>tamina</w:t>
+      </w:r>
+      <w:r>
+        <w:t xml:space="preserve"> making sure the player makes careful usage as to when to use this. </w:t>
+      </w:r>
+    </w:p>
+    <w:p>
+      <w:r>
+        <w:rPr>
+          <w:b/>
+          <w:bCs/>
+        </w:rPr>
+        <w:lastRenderedPageBreak/>
+        <w:t>Jump</w:t>
+      </w:r>
+      <w:r>
+        <w:rPr>
+          <w:b/>
+          <w:bCs/>
+        </w:rPr>
+        <w:t xml:space="preserve"> - </w:t>
+      </w:r>
+      <w:r>
+        <w:t xml:space="preserve">Grants </w:t>
+      </w:r>
+      <w:r>
+        <w:t xml:space="preserve">player </w:t>
+      </w:r>
+      <w:r>
+        <w:t>access to elevated terrain or environmental advantages</w:t>
+      </w:r>
+      <w:r>
+        <w:t xml:space="preserve"> potentially allowing them to escape enemies.</w:t>
+      </w:r>
+    </w:p>
+    <w:p>
+      <w:pPr>
+        <w:rPr>
+          <w:b/>
+          <w:bCs/>
+        </w:rPr>
+      </w:pPr>
+      <w:r>
+        <w:t xml:space="preserve">Flight – Grants temporary flight for the player allowing them to either evade enemies or scout the area to their advantage. </w:t>
+      </w:r>
+    </w:p>
+    <w:p>
+      <w:pPr>
+        <w:pStyle w:val="Heading3"/>
+      </w:pPr>
+      <w:r>
+        <w:t>3.5.</w:t>
+      </w:r>
+      <w:r>
+        <w:t>2</w:t>
+      </w:r>
+      <w:r>
+        <w:t xml:space="preserve"> </w:t>
+      </w:r>
+      <w:r>
+        <w:t>Health System</w:t>
+      </w:r>
+    </w:p>
+    <w:p>
+      <w:r>
+        <w:t xml:space="preserve">The Health System defines the player’s </w:t>
+      </w:r>
+      <w:r>
+        <w:t>current status</w:t>
+      </w:r>
+      <w:r>
+        <w:t xml:space="preserve"> and establishes the primary </w:t>
+      </w:r>
+      <w:r>
+        <w:t>motive of</w:t>
+      </w:r>
+      <w:r>
+        <w:t xml:space="preserve"> con</w:t>
+      </w:r>
+      <w:r>
+        <w:t>tinuing the game</w:t>
+      </w:r>
+      <w:r>
+        <w:t xml:space="preserve">. </w:t>
+      </w:r>
+      <w:r>
+        <w:t xml:space="preserve"> Both enemies and players can regenerate their health overtime, for the player this requires allocation of coins to upgrade </w:t>
+      </w:r>
+      <w:r>
+        <w:t xml:space="preserve">skills </w:t>
+      </w:r>
+      <w:r>
+        <w:t xml:space="preserve">and improve this regeneration, enemies will also be able to regenerate health in the more advanced </w:t>
+      </w:r>
+      <w:r>
+        <w:t>waves</w:t>
+      </w:r>
+      <w:r>
+        <w:t xml:space="preserve"> to prevent players playing a more passive style</w:t>
+      </w:r>
+      <w:r>
+        <w:t xml:space="preserve"> such as stalling</w:t>
+      </w:r>
+      <w:r>
+        <w:t xml:space="preserve">. </w:t>
+      </w:r>
+    </w:p>
+    <w:p>
+      <w:pPr>
+        <w:pStyle w:val="Heading3"/>
+      </w:pPr>
+      <w:r>
+        <w:t>3.5.</w:t>
+      </w:r>
+      <w:r>
+        <w:t>3</w:t>
+      </w:r>
+      <w:r>
+        <w:t xml:space="preserve"> </w:t>
+      </w:r>
+      <w:r>
+        <w:t xml:space="preserve">Class Types </w:t>
+      </w:r>
+    </w:p>
+    <w:p>
+      <w:r>
+        <w:t>2 class types the player can choose:</w:t>
+      </w:r>
+    </w:p>
+    <w:p>
+      <w:pPr>
+        <w:pStyle w:val="ListParagraph"/>
+        <w:numPr>
+          <w:ilvl w:val="0"/>
+          <w:numId w:val="11"/>
+        </w:numPr>
+      </w:pPr>
+      <w:r>
+        <w:t>Knight</w:t>
+      </w:r>
+    </w:p>
+    <w:p>
+      <w:pPr>
+        <w:pStyle w:val="ListParagraph"/>
+        <w:numPr>
+          <w:ilvl w:val="0"/>
+          <w:numId w:val="11"/>
+        </w:numPr>
+      </w:pPr>
+      <w:r>
+        <w:t xml:space="preserve">Archer </w:t>
+      </w:r>
+    </w:p>
+    <w:p/>
+    <w:p>
+      <w:pPr>
+        <w:pStyle w:val="Heading2"/>
+      </w:pPr>
+      <w:r>
         <w:t>4. Conclusion</w:t>
       </w:r>
     </w:p>
     <w:p>
-      <w:r>
-        <w:t>Currently, I have implemented some core features within the game.</w:t>
-      </w:r>
-    </w:p>
-    <w:p>
-      <w:r>
+      <w:pPr>
+        <w:rPr>
+          <w:sz w:val="22"/>
+          <w:szCs w:val="22"/>
+        </w:rPr>
+      </w:pPr>
+      <w:r>
+        <w:rPr>
+          <w:sz w:val="22"/>
+          <w:szCs w:val="22"/>
+        </w:rPr>
+        <w:t>Currently, I have implemented some core features within the game</w:t>
+      </w:r>
+      <w:r>
+        <w:rPr>
+          <w:sz w:val="22"/>
+          <w:szCs w:val="22"/>
+        </w:rPr>
+        <w:t xml:space="preserve"> this being the character and the user interface for the game since this will be the first features of the game the player will actually see and interact with. </w:t>
+      </w:r>
+    </w:p>
+    <w:p>
+      <w:pPr>
+        <w:rPr>
+          <w:sz w:val="22"/>
+          <w:szCs w:val="22"/>
+        </w:rPr>
+      </w:pPr>
+      <w:r>
+        <w:rPr>
+          <w:sz w:val="22"/>
+          <w:szCs w:val="22"/>
+        </w:rPr>
         <w:t xml:space="preserve">GitHub link: </w:t>
       </w:r>
       <w:hyperlink r:id="rId9" w:history="1">
         <w:r>
           <w:rPr>
             <w:rStyle w:val="Hyperlink"/>
+            <w:sz w:val="22"/>
+            <w:szCs w:val="22"/>
           </w:rPr>
-          <w:t>https://github.com/WilliamCheung2004/Slime</w:t>
-        </w:r>
-        <w:r>
-          <w:rPr>
-            <w:rStyle w:val="Hyperlink"/>
-          </w:rPr>
-          <w:t>-</w:t>
-        </w:r>
-        <w:r>
-          <w:rPr>
-            <w:rStyle w:val="Hyperlink"/>
-          </w:rPr>
-          <w:t>Fight-</w:t>
+          <w:t>https://github.com/WilliamCheung2004/Slime-Fight-</w:t>
         </w:r>
       </w:hyperlink>
     </w:p>
@@ -1911,17 +2646,16 @@
         <w:jc w:val="both"/>
         <w:rPr>
           <w:rFonts w:ascii="Arial" w:hAnsi="Arial" w:cs="Arial"/>
-          <w:sz w:val="28"/>
-          <w:szCs w:val="28"/>
+          <w:sz w:val="22"/>
+          <w:szCs w:val="22"/>
         </w:rPr>
       </w:pPr>
       <w:r>
         <w:rPr>
           <w:rFonts w:ascii="Arial" w:hAnsi="Arial" w:cs="Arial"/>
-          <w:sz w:val="28"/>
-          <w:szCs w:val="28"/>
-        </w:rPr>
-        <w:lastRenderedPageBreak/>
+          <w:sz w:val="22"/>
+          <w:szCs w:val="22"/>
+        </w:rPr>
         <w:t xml:space="preserve">References </w:t>
       </w:r>
     </w:p>
@@ -1931,35 +2665,268 @@
         <w:jc w:val="both"/>
         <w:rPr>
           <w:rFonts w:ascii="Arial" w:hAnsi="Arial" w:cs="Arial"/>
-          <w:sz w:val="28"/>
-          <w:szCs w:val="28"/>
+          <w:sz w:val="22"/>
+          <w:szCs w:val="22"/>
         </w:rPr>
       </w:pPr>
       <w:r>
         <w:rPr>
           <w:rFonts w:ascii="Arial" w:hAnsi="Arial" w:cs="Arial"/>
-          <w:sz w:val="28"/>
-          <w:szCs w:val="28"/>
+          <w:sz w:val="22"/>
+          <w:szCs w:val="22"/>
         </w:rPr>
         <w:t>Appendix</w:t>
       </w:r>
       <w:r>
         <w:rPr>
           <w:rFonts w:ascii="Arial" w:hAnsi="Arial" w:cs="Arial"/>
-          <w:sz w:val="28"/>
-          <w:szCs w:val="28"/>
+          <w:sz w:val="22"/>
+          <w:szCs w:val="22"/>
         </w:rPr>
         <w:t xml:space="preserve"> A </w:t>
       </w:r>
     </w:p>
     <w:p>
-      <w:r>
-        <w:rPr>
+      <w:pPr>
+        <w:pStyle w:val="ListParagraph"/>
+        <w:spacing w:line="240" w:lineRule="auto"/>
+        <w:jc w:val="both"/>
+        <w:rPr>
+          <w:rFonts w:ascii="Arial" w:hAnsi="Arial" w:cs="Arial"/>
+          <w:sz w:val="22"/>
+          <w:szCs w:val="22"/>
+        </w:rPr>
+      </w:pPr>
+    </w:p>
+    <w:p>
+      <w:pPr>
+        <w:jc w:val="both"/>
+        <w:rPr>
+          <w:rFonts w:ascii="Arial" w:hAnsi="Arial" w:cs="Arial"/>
+          <w:sz w:val="22"/>
+          <w:szCs w:val="22"/>
+        </w:rPr>
+      </w:pPr>
+    </w:p>
+    <w:p>
+      <w:pPr>
+        <w:jc w:val="both"/>
+        <w:rPr>
+          <w:rFonts w:ascii="Arial" w:hAnsi="Arial" w:cs="Arial"/>
           <w:noProof/>
-        </w:rPr>
+          <w:sz w:val="22"/>
+          <w:szCs w:val="22"/>
+        </w:rPr>
+      </w:pPr>
+    </w:p>
+    <w:p>
+      <w:pPr>
+        <w:jc w:val="both"/>
+        <w:rPr>
+          <w:rFonts w:ascii="Arial" w:hAnsi="Arial" w:cs="Arial"/>
+          <w:sz w:val="22"/>
+          <w:szCs w:val="22"/>
+        </w:rPr>
+      </w:pPr>
+      <w:r>
+        <w:rPr>
+          <w:rFonts w:ascii="Arial" w:hAnsi="Arial" w:cs="Arial"/>
+          <w:sz w:val="22"/>
+          <w:szCs w:val="22"/>
+        </w:rPr>
+        <w:lastRenderedPageBreak/>
         <w:drawing>
-          <wp:inline distT="0" distB="0" distL="0" distR="0" wp14:anchorId="53559373" wp14:editId="149F2D7C">
-            <wp:extent cx="3966174" cy="2524448"/>
+          <wp:inline distT="0" distB="0" distL="0" distR="0" wp14:anchorId="1F6E61AE" wp14:editId="3DB67BDF">
+            <wp:extent cx="2874723" cy="980005"/>
+            <wp:effectExtent l="0" t="0" r="1905" b="0"/>
+            <wp:docPr id="93147516" name="Picture 1"/>
+            <wp:cNvGraphicFramePr>
+              <a:graphicFrameLocks xmlns:a="http://schemas.openxmlformats.org/drawingml/2006/main" noChangeAspect="1"/>
+            </wp:cNvGraphicFramePr>
+            <a:graphic xmlns:a="http://schemas.openxmlformats.org/drawingml/2006/main">
+              <a:graphicData uri="http://schemas.openxmlformats.org/drawingml/2006/picture">
+                <pic:pic xmlns:pic="http://schemas.openxmlformats.org/drawingml/2006/picture">
+                  <pic:nvPicPr>
+                    <pic:cNvPr id="93147516" name=""/>
+                    <pic:cNvPicPr/>
+                  </pic:nvPicPr>
+                  <pic:blipFill>
+                    <a:blip r:embed="rId10"/>
+                    <a:stretch>
+                      <a:fillRect/>
+                    </a:stretch>
+                  </pic:blipFill>
+                  <pic:spPr>
+                    <a:xfrm>
+                      <a:off x="0" y="0"/>
+                      <a:ext cx="2922570" cy="996316"/>
+                    </a:xfrm>
+                    <a:prstGeom prst="rect">
+                      <a:avLst/>
+                    </a:prstGeom>
+                  </pic:spPr>
+                </pic:pic>
+              </a:graphicData>
+            </a:graphic>
+          </wp:inline>
+        </w:drawing>
+      </w:r>
+      <w:r>
+        <w:rPr>
+          <w:rFonts w:ascii="Arial" w:hAnsi="Arial" w:cs="Arial"/>
+          <w:sz w:val="22"/>
+          <w:szCs w:val="22"/>
+        </w:rPr>
+        <w:drawing>
+          <wp:inline distT="0" distB="0" distL="0" distR="0" wp14:anchorId="151B3C4B" wp14:editId="50E4B54E">
+            <wp:extent cx="2486416" cy="968562"/>
+            <wp:effectExtent l="0" t="0" r="0" b="3175"/>
+            <wp:docPr id="184828511" name="Picture 1"/>
+            <wp:cNvGraphicFramePr>
+              <a:graphicFrameLocks xmlns:a="http://schemas.openxmlformats.org/drawingml/2006/main" noChangeAspect="1"/>
+            </wp:cNvGraphicFramePr>
+            <a:graphic xmlns:a="http://schemas.openxmlformats.org/drawingml/2006/main">
+              <a:graphicData uri="http://schemas.openxmlformats.org/drawingml/2006/picture">
+                <pic:pic xmlns:pic="http://schemas.openxmlformats.org/drawingml/2006/picture">
+                  <pic:nvPicPr>
+                    <pic:cNvPr id="184828511" name=""/>
+                    <pic:cNvPicPr/>
+                  </pic:nvPicPr>
+                  <pic:blipFill>
+                    <a:blip r:embed="rId11"/>
+                    <a:stretch>
+                      <a:fillRect/>
+                    </a:stretch>
+                  </pic:blipFill>
+                  <pic:spPr>
+                    <a:xfrm>
+                      <a:off x="0" y="0"/>
+                      <a:ext cx="2623216" cy="1021851"/>
+                    </a:xfrm>
+                    <a:prstGeom prst="rect">
+                      <a:avLst/>
+                    </a:prstGeom>
+                  </pic:spPr>
+                </pic:pic>
+              </a:graphicData>
+            </a:graphic>
+          </wp:inline>
+        </w:drawing>
+      </w:r>
+      <w:r>
+        <w:rPr>
+          <w:rFonts w:ascii="Arial" w:hAnsi="Arial" w:cs="Arial"/>
+          <w:sz w:val="22"/>
+          <w:szCs w:val="22"/>
+        </w:rPr>
+        <w:drawing>
+          <wp:inline distT="0" distB="0" distL="0" distR="0" wp14:anchorId="129A7EC3" wp14:editId="4BFDBFBA">
+            <wp:extent cx="3206663" cy="1163153"/>
+            <wp:effectExtent l="0" t="0" r="0" b="0"/>
+            <wp:docPr id="454493858" name="Picture 1"/>
+            <wp:cNvGraphicFramePr>
+              <a:graphicFrameLocks xmlns:a="http://schemas.openxmlformats.org/drawingml/2006/main" noChangeAspect="1"/>
+            </wp:cNvGraphicFramePr>
+            <a:graphic xmlns:a="http://schemas.openxmlformats.org/drawingml/2006/main">
+              <a:graphicData uri="http://schemas.openxmlformats.org/drawingml/2006/picture">
+                <pic:pic xmlns:pic="http://schemas.openxmlformats.org/drawingml/2006/picture">
+                  <pic:nvPicPr>
+                    <pic:cNvPr id="454493858" name=""/>
+                    <pic:cNvPicPr/>
+                  </pic:nvPicPr>
+                  <pic:blipFill>
+                    <a:blip r:embed="rId12"/>
+                    <a:stretch>
+                      <a:fillRect/>
+                    </a:stretch>
+                  </pic:blipFill>
+                  <pic:spPr>
+                    <a:xfrm>
+                      <a:off x="0" y="0"/>
+                      <a:ext cx="3235727" cy="1173695"/>
+                    </a:xfrm>
+                    <a:prstGeom prst="rect">
+                      <a:avLst/>
+                    </a:prstGeom>
+                  </pic:spPr>
+                </pic:pic>
+              </a:graphicData>
+            </a:graphic>
+          </wp:inline>
+        </w:drawing>
+      </w:r>
+    </w:p>
+    <w:p>
+      <w:pPr>
+        <w:jc w:val="both"/>
+        <w:rPr>
+          <w:rFonts w:ascii="Arial" w:hAnsi="Arial" w:cs="Arial"/>
+          <w:sz w:val="22"/>
+          <w:szCs w:val="22"/>
+        </w:rPr>
+      </w:pPr>
+      <w:r>
+        <w:rPr>
+          <w:rFonts w:ascii="Arial" w:hAnsi="Arial" w:cs="Arial"/>
+          <w:noProof/>
+          <w:sz w:val="22"/>
+          <w:szCs w:val="22"/>
+        </w:rPr>
+        <w:drawing>
+          <wp:inline distT="0" distB="0" distL="0" distR="0" wp14:anchorId="72533D5C" wp14:editId="7E65EBA7">
+            <wp:extent cx="3937000" cy="2238062"/>
+            <wp:effectExtent l="0" t="0" r="6350" b="0"/>
+            <wp:docPr id="597463188" name="Picture 1"/>
+            <wp:cNvGraphicFramePr>
+              <a:graphicFrameLocks xmlns:a="http://schemas.openxmlformats.org/drawingml/2006/main" noChangeAspect="1"/>
+            </wp:cNvGraphicFramePr>
+            <a:graphic xmlns:a="http://schemas.openxmlformats.org/drawingml/2006/main">
+              <a:graphicData uri="http://schemas.openxmlformats.org/drawingml/2006/picture">
+                <pic:pic xmlns:pic="http://schemas.openxmlformats.org/drawingml/2006/picture">
+                  <pic:nvPicPr>
+                    <pic:cNvPr id="597463188" name=""/>
+                    <pic:cNvPicPr/>
+                  </pic:nvPicPr>
+                  <pic:blipFill>
+                    <a:blip r:embed="rId13"/>
+                    <a:stretch>
+                      <a:fillRect/>
+                    </a:stretch>
+                  </pic:blipFill>
+                  <pic:spPr>
+                    <a:xfrm>
+                      <a:off x="0" y="0"/>
+                      <a:ext cx="3956126" cy="2248935"/>
+                    </a:xfrm>
+                    <a:prstGeom prst="rect">
+                      <a:avLst/>
+                    </a:prstGeom>
+                  </pic:spPr>
+                </pic:pic>
+              </a:graphicData>
+            </a:graphic>
+          </wp:inline>
+        </w:drawing>
+      </w:r>
+    </w:p>
+    <w:p>
+      <w:pPr>
+        <w:jc w:val="both"/>
+        <w:rPr>
+          <w:rFonts w:ascii="Arial" w:hAnsi="Arial" w:cs="Arial"/>
+          <w:sz w:val="22"/>
+          <w:szCs w:val="22"/>
+        </w:rPr>
+      </w:pPr>
+      <w:r>
+        <w:rPr>
+          <w:noProof/>
+          <w:sz w:val="22"/>
+          <w:szCs w:val="22"/>
+        </w:rPr>
+        <w:drawing>
+          <wp:inline distT="0" distB="0" distL="0" distR="0" wp14:anchorId="7DC8C24D" wp14:editId="19D2EC80">
+            <wp:extent cx="2878667" cy="1832256"/>
             <wp:effectExtent l="0" t="0" r="0" b="0"/>
             <wp:docPr id="715036842" name="Picture 1"/>
             <wp:cNvGraphicFramePr>
@@ -1973,7 +2940,7 @@
                     <pic:cNvPicPr/>
                   </pic:nvPicPr>
                   <pic:blipFill>
-                    <a:blip r:embed="rId10"/>
+                    <a:blip r:embed="rId14"/>
                     <a:stretch>
                       <a:fillRect/>
                     </a:stretch>
@@ -1981,125 +2948,7 @@
                   <pic:spPr>
                     <a:xfrm>
                       <a:off x="0" y="0"/>
-                      <a:ext cx="3974518" cy="2529759"/>
-                    </a:xfrm>
-                    <a:prstGeom prst="rect">
-                      <a:avLst/>
-                    </a:prstGeom>
-                  </pic:spPr>
-                </pic:pic>
-              </a:graphicData>
-            </a:graphic>
-          </wp:inline>
-        </w:drawing>
-      </w:r>
-    </w:p>
-    <w:p>
-      <w:r>
-        <w:rPr>
-          <w:noProof/>
-        </w:rPr>
-        <w:drawing>
-          <wp:inline distT="0" distB="0" distL="0" distR="0" wp14:anchorId="11C876BE" wp14:editId="5F82106D">
-            <wp:extent cx="5731510" cy="3322320"/>
-            <wp:effectExtent l="0" t="0" r="2540" b="0"/>
-            <wp:docPr id="981777505" name="Picture 1"/>
-            <wp:cNvGraphicFramePr>
-              <a:graphicFrameLocks xmlns:a="http://schemas.openxmlformats.org/drawingml/2006/main" noChangeAspect="1"/>
-            </wp:cNvGraphicFramePr>
-            <a:graphic xmlns:a="http://schemas.openxmlformats.org/drawingml/2006/main">
-              <a:graphicData uri="http://schemas.openxmlformats.org/drawingml/2006/picture">
-                <pic:pic xmlns:pic="http://schemas.openxmlformats.org/drawingml/2006/picture">
-                  <pic:nvPicPr>
-                    <pic:cNvPr id="981777505" name=""/>
-                    <pic:cNvPicPr/>
-                  </pic:nvPicPr>
-                  <pic:blipFill>
-                    <a:blip r:embed="rId11"/>
-                    <a:stretch>
-                      <a:fillRect/>
-                    </a:stretch>
-                  </pic:blipFill>
-                  <pic:spPr>
-                    <a:xfrm>
-                      <a:off x="0" y="0"/>
-                      <a:ext cx="5731510" cy="3322320"/>
-                    </a:xfrm>
-                    <a:prstGeom prst="rect">
-                      <a:avLst/>
-                    </a:prstGeom>
-                  </pic:spPr>
-                </pic:pic>
-              </a:graphicData>
-            </a:graphic>
-          </wp:inline>
-        </w:drawing>
-      </w:r>
-    </w:p>
-    <w:p>
-      <w:pPr>
-        <w:pStyle w:val="ListParagraph"/>
-        <w:spacing w:line="240" w:lineRule="auto"/>
-        <w:jc w:val="both"/>
-        <w:rPr>
-          <w:rFonts w:ascii="Arial" w:hAnsi="Arial" w:cs="Arial"/>
-          <w:sz w:val="22"/>
-          <w:szCs w:val="22"/>
-        </w:rPr>
-      </w:pPr>
-    </w:p>
-    <w:p>
-      <w:pPr>
-        <w:jc w:val="both"/>
-        <w:rPr>
-          <w:rFonts w:ascii="Arial" w:hAnsi="Arial" w:cs="Arial"/>
-          <w:sz w:val="22"/>
-          <w:szCs w:val="22"/>
-        </w:rPr>
-      </w:pPr>
-    </w:p>
-    <w:p>
-      <w:pPr>
-        <w:jc w:val="both"/>
-        <w:rPr>
-          <w:rFonts w:ascii="Arial" w:hAnsi="Arial" w:cs="Arial"/>
-          <w:sz w:val="22"/>
-          <w:szCs w:val="22"/>
-        </w:rPr>
-      </w:pPr>
-      <w:r>
-        <w:rPr>
-          <w:rFonts w:ascii="Arial" w:hAnsi="Arial" w:cs="Arial"/>
-          <w:noProof/>
-          <w:sz w:val="22"/>
-          <w:szCs w:val="22"/>
-        </w:rPr>
-        <w:lastRenderedPageBreak/>
-        <w:drawing>
-          <wp:inline distT="0" distB="0" distL="0" distR="0" wp14:anchorId="5B667B20" wp14:editId="58D18214">
-            <wp:extent cx="5731510" cy="3258185"/>
-            <wp:effectExtent l="0" t="0" r="2540" b="0"/>
-            <wp:docPr id="597463188" name="Picture 1"/>
-            <wp:cNvGraphicFramePr>
-              <a:graphicFrameLocks xmlns:a="http://schemas.openxmlformats.org/drawingml/2006/main" noChangeAspect="1"/>
-            </wp:cNvGraphicFramePr>
-            <a:graphic xmlns:a="http://schemas.openxmlformats.org/drawingml/2006/main">
-              <a:graphicData uri="http://schemas.openxmlformats.org/drawingml/2006/picture">
-                <pic:pic xmlns:pic="http://schemas.openxmlformats.org/drawingml/2006/picture">
-                  <pic:nvPicPr>
-                    <pic:cNvPr id="597463188" name=""/>
-                    <pic:cNvPicPr/>
-                  </pic:nvPicPr>
-                  <pic:blipFill>
-                    <a:blip r:embed="rId12"/>
-                    <a:stretch>
-                      <a:fillRect/>
-                    </a:stretch>
-                  </pic:blipFill>
-                  <pic:spPr>
-                    <a:xfrm>
-                      <a:off x="0" y="0"/>
-                      <a:ext cx="5731510" cy="3258185"/>
+                      <a:ext cx="2890458" cy="1839761"/>
                     </a:xfrm>
                     <a:prstGeom prst="rect">
                       <a:avLst/>
@@ -2238,6 +3087,566 @@
     </w:lvl>
   </w:abstractNum>
   <w:abstractNum w:abstractNumId="1" w15:restartNumberingAfterBreak="0">
+    <w:nsid w:val="1C6B66FF"/>
+    <w:multiLevelType w:val="hybridMultilevel"/>
+    <w:tmpl w:val="0DF4CDAA"/>
+    <w:lvl w:ilvl="0" w:tplc="08090001">
+      <w:start w:val="1"/>
+      <w:numFmt w:val="bullet"/>
+      <w:lvlText w:val=""/>
+      <w:lvlJc w:val="left"/>
+      <w:pPr>
+        <w:ind w:left="720" w:hanging="360"/>
+      </w:pPr>
+      <w:rPr>
+        <w:rFonts w:ascii="Symbol" w:hAnsi="Symbol" w:hint="default"/>
+      </w:rPr>
+    </w:lvl>
+    <w:lvl w:ilvl="1" w:tplc="08090003" w:tentative="1">
+      <w:start w:val="1"/>
+      <w:numFmt w:val="bullet"/>
+      <w:lvlText w:val="o"/>
+      <w:lvlJc w:val="left"/>
+      <w:pPr>
+        <w:ind w:left="1440" w:hanging="360"/>
+      </w:pPr>
+      <w:rPr>
+        <w:rFonts w:ascii="Courier New" w:hAnsi="Courier New" w:cs="Courier New" w:hint="default"/>
+      </w:rPr>
+    </w:lvl>
+    <w:lvl w:ilvl="2" w:tplc="08090005" w:tentative="1">
+      <w:start w:val="1"/>
+      <w:numFmt w:val="bullet"/>
+      <w:lvlText w:val=""/>
+      <w:lvlJc w:val="left"/>
+      <w:pPr>
+        <w:ind w:left="2160" w:hanging="360"/>
+      </w:pPr>
+      <w:rPr>
+        <w:rFonts w:ascii="Wingdings" w:hAnsi="Wingdings" w:hint="default"/>
+      </w:rPr>
+    </w:lvl>
+    <w:lvl w:ilvl="3" w:tplc="08090001" w:tentative="1">
+      <w:start w:val="1"/>
+      <w:numFmt w:val="bullet"/>
+      <w:lvlText w:val=""/>
+      <w:lvlJc w:val="left"/>
+      <w:pPr>
+        <w:ind w:left="2880" w:hanging="360"/>
+      </w:pPr>
+      <w:rPr>
+        <w:rFonts w:ascii="Symbol" w:hAnsi="Symbol" w:hint="default"/>
+      </w:rPr>
+    </w:lvl>
+    <w:lvl w:ilvl="4" w:tplc="08090003" w:tentative="1">
+      <w:start w:val="1"/>
+      <w:numFmt w:val="bullet"/>
+      <w:lvlText w:val="o"/>
+      <w:lvlJc w:val="left"/>
+      <w:pPr>
+        <w:ind w:left="3600" w:hanging="360"/>
+      </w:pPr>
+      <w:rPr>
+        <w:rFonts w:ascii="Courier New" w:hAnsi="Courier New" w:cs="Courier New" w:hint="default"/>
+      </w:rPr>
+    </w:lvl>
+    <w:lvl w:ilvl="5" w:tplc="08090005" w:tentative="1">
+      <w:start w:val="1"/>
+      <w:numFmt w:val="bullet"/>
+      <w:lvlText w:val=""/>
+      <w:lvlJc w:val="left"/>
+      <w:pPr>
+        <w:ind w:left="4320" w:hanging="360"/>
+      </w:pPr>
+      <w:rPr>
+        <w:rFonts w:ascii="Wingdings" w:hAnsi="Wingdings" w:hint="default"/>
+      </w:rPr>
+    </w:lvl>
+    <w:lvl w:ilvl="6" w:tplc="08090001" w:tentative="1">
+      <w:start w:val="1"/>
+      <w:numFmt w:val="bullet"/>
+      <w:lvlText w:val=""/>
+      <w:lvlJc w:val="left"/>
+      <w:pPr>
+        <w:ind w:left="5040" w:hanging="360"/>
+      </w:pPr>
+      <w:rPr>
+        <w:rFonts w:ascii="Symbol" w:hAnsi="Symbol" w:hint="default"/>
+      </w:rPr>
+    </w:lvl>
+    <w:lvl w:ilvl="7" w:tplc="08090003" w:tentative="1">
+      <w:start w:val="1"/>
+      <w:numFmt w:val="bullet"/>
+      <w:lvlText w:val="o"/>
+      <w:lvlJc w:val="left"/>
+      <w:pPr>
+        <w:ind w:left="5760" w:hanging="360"/>
+      </w:pPr>
+      <w:rPr>
+        <w:rFonts w:ascii="Courier New" w:hAnsi="Courier New" w:cs="Courier New" w:hint="default"/>
+      </w:rPr>
+    </w:lvl>
+    <w:lvl w:ilvl="8" w:tplc="08090005" w:tentative="1">
+      <w:start w:val="1"/>
+      <w:numFmt w:val="bullet"/>
+      <w:lvlText w:val=""/>
+      <w:lvlJc w:val="left"/>
+      <w:pPr>
+        <w:ind w:left="6480" w:hanging="360"/>
+      </w:pPr>
+      <w:rPr>
+        <w:rFonts w:ascii="Wingdings" w:hAnsi="Wingdings" w:hint="default"/>
+      </w:rPr>
+    </w:lvl>
+  </w:abstractNum>
+  <w:abstractNum w:abstractNumId="2" w15:restartNumberingAfterBreak="0">
+    <w:nsid w:val="23BA5E56"/>
+    <w:multiLevelType w:val="multilevel"/>
+    <w:tmpl w:val="A636F4F4"/>
+    <w:lvl w:ilvl="0">
+      <w:start w:val="1"/>
+      <w:numFmt w:val="bullet"/>
+      <w:lvlText w:val=""/>
+      <w:lvlJc w:val="left"/>
+      <w:pPr>
+        <w:tabs>
+          <w:tab w:val="num" w:pos="720"/>
+        </w:tabs>
+        <w:ind w:left="720" w:hanging="360"/>
+      </w:pPr>
+      <w:rPr>
+        <w:rFonts w:ascii="Symbol" w:hAnsi="Symbol" w:hint="default"/>
+        <w:sz w:val="20"/>
+      </w:rPr>
+    </w:lvl>
+    <w:lvl w:ilvl="1" w:tentative="1">
+      <w:start w:val="1"/>
+      <w:numFmt w:val="bullet"/>
+      <w:lvlText w:val="o"/>
+      <w:lvlJc w:val="left"/>
+      <w:pPr>
+        <w:tabs>
+          <w:tab w:val="num" w:pos="1440"/>
+        </w:tabs>
+        <w:ind w:left="1440" w:hanging="360"/>
+      </w:pPr>
+      <w:rPr>
+        <w:rFonts w:ascii="Courier New" w:hAnsi="Courier New" w:hint="default"/>
+        <w:sz w:val="20"/>
+      </w:rPr>
+    </w:lvl>
+    <w:lvl w:ilvl="2" w:tentative="1">
+      <w:start w:val="1"/>
+      <w:numFmt w:val="bullet"/>
+      <w:lvlText w:val=""/>
+      <w:lvlJc w:val="left"/>
+      <w:pPr>
+        <w:tabs>
+          <w:tab w:val="num" w:pos="2160"/>
+        </w:tabs>
+        <w:ind w:left="2160" w:hanging="360"/>
+      </w:pPr>
+      <w:rPr>
+        <w:rFonts w:ascii="Wingdings" w:hAnsi="Wingdings" w:hint="default"/>
+        <w:sz w:val="20"/>
+      </w:rPr>
+    </w:lvl>
+    <w:lvl w:ilvl="3" w:tentative="1">
+      <w:start w:val="1"/>
+      <w:numFmt w:val="bullet"/>
+      <w:lvlText w:val=""/>
+      <w:lvlJc w:val="left"/>
+      <w:pPr>
+        <w:tabs>
+          <w:tab w:val="num" w:pos="2880"/>
+        </w:tabs>
+        <w:ind w:left="2880" w:hanging="360"/>
+      </w:pPr>
+      <w:rPr>
+        <w:rFonts w:ascii="Wingdings" w:hAnsi="Wingdings" w:hint="default"/>
+        <w:sz w:val="20"/>
+      </w:rPr>
+    </w:lvl>
+    <w:lvl w:ilvl="4" w:tentative="1">
+      <w:start w:val="1"/>
+      <w:numFmt w:val="bullet"/>
+      <w:lvlText w:val=""/>
+      <w:lvlJc w:val="left"/>
+      <w:pPr>
+        <w:tabs>
+          <w:tab w:val="num" w:pos="3600"/>
+        </w:tabs>
+        <w:ind w:left="3600" w:hanging="360"/>
+      </w:pPr>
+      <w:rPr>
+        <w:rFonts w:ascii="Wingdings" w:hAnsi="Wingdings" w:hint="default"/>
+        <w:sz w:val="20"/>
+      </w:rPr>
+    </w:lvl>
+    <w:lvl w:ilvl="5" w:tentative="1">
+      <w:start w:val="1"/>
+      <w:numFmt w:val="bullet"/>
+      <w:lvlText w:val=""/>
+      <w:lvlJc w:val="left"/>
+      <w:pPr>
+        <w:tabs>
+          <w:tab w:val="num" w:pos="4320"/>
+        </w:tabs>
+        <w:ind w:left="4320" w:hanging="360"/>
+      </w:pPr>
+      <w:rPr>
+        <w:rFonts w:ascii="Wingdings" w:hAnsi="Wingdings" w:hint="default"/>
+        <w:sz w:val="20"/>
+      </w:rPr>
+    </w:lvl>
+    <w:lvl w:ilvl="6" w:tentative="1">
+      <w:start w:val="1"/>
+      <w:numFmt w:val="bullet"/>
+      <w:lvlText w:val=""/>
+      <w:lvlJc w:val="left"/>
+      <w:pPr>
+        <w:tabs>
+          <w:tab w:val="num" w:pos="5040"/>
+        </w:tabs>
+        <w:ind w:left="5040" w:hanging="360"/>
+      </w:pPr>
+      <w:rPr>
+        <w:rFonts w:ascii="Wingdings" w:hAnsi="Wingdings" w:hint="default"/>
+        <w:sz w:val="20"/>
+      </w:rPr>
+    </w:lvl>
+    <w:lvl w:ilvl="7" w:tentative="1">
+      <w:start w:val="1"/>
+      <w:numFmt w:val="bullet"/>
+      <w:lvlText w:val=""/>
+      <w:lvlJc w:val="left"/>
+      <w:pPr>
+        <w:tabs>
+          <w:tab w:val="num" w:pos="5760"/>
+        </w:tabs>
+        <w:ind w:left="5760" w:hanging="360"/>
+      </w:pPr>
+      <w:rPr>
+        <w:rFonts w:ascii="Wingdings" w:hAnsi="Wingdings" w:hint="default"/>
+        <w:sz w:val="20"/>
+      </w:rPr>
+    </w:lvl>
+    <w:lvl w:ilvl="8" w:tentative="1">
+      <w:start w:val="1"/>
+      <w:numFmt w:val="bullet"/>
+      <w:lvlText w:val=""/>
+      <w:lvlJc w:val="left"/>
+      <w:pPr>
+        <w:tabs>
+          <w:tab w:val="num" w:pos="6480"/>
+        </w:tabs>
+        <w:ind w:left="6480" w:hanging="360"/>
+      </w:pPr>
+      <w:rPr>
+        <w:rFonts w:ascii="Wingdings" w:hAnsi="Wingdings" w:hint="default"/>
+        <w:sz w:val="20"/>
+      </w:rPr>
+    </w:lvl>
+  </w:abstractNum>
+  <w:abstractNum w:abstractNumId="3" w15:restartNumberingAfterBreak="0">
+    <w:nsid w:val="23E54345"/>
+    <w:multiLevelType w:val="multilevel"/>
+    <w:tmpl w:val="EBF261E2"/>
+    <w:lvl w:ilvl="0">
+      <w:start w:val="1"/>
+      <w:numFmt w:val="bullet"/>
+      <w:lvlText w:val=""/>
+      <w:lvlJc w:val="left"/>
+      <w:pPr>
+        <w:tabs>
+          <w:tab w:val="num" w:pos="720"/>
+        </w:tabs>
+        <w:ind w:left="720" w:hanging="360"/>
+      </w:pPr>
+      <w:rPr>
+        <w:rFonts w:ascii="Symbol" w:hAnsi="Symbol" w:hint="default"/>
+        <w:sz w:val="20"/>
+      </w:rPr>
+    </w:lvl>
+    <w:lvl w:ilvl="1" w:tentative="1">
+      <w:start w:val="1"/>
+      <w:numFmt w:val="bullet"/>
+      <w:lvlText w:val="o"/>
+      <w:lvlJc w:val="left"/>
+      <w:pPr>
+        <w:tabs>
+          <w:tab w:val="num" w:pos="1440"/>
+        </w:tabs>
+        <w:ind w:left="1440" w:hanging="360"/>
+      </w:pPr>
+      <w:rPr>
+        <w:rFonts w:ascii="Courier New" w:hAnsi="Courier New" w:hint="default"/>
+        <w:sz w:val="20"/>
+      </w:rPr>
+    </w:lvl>
+    <w:lvl w:ilvl="2" w:tentative="1">
+      <w:start w:val="1"/>
+      <w:numFmt w:val="bullet"/>
+      <w:lvlText w:val=""/>
+      <w:lvlJc w:val="left"/>
+      <w:pPr>
+        <w:tabs>
+          <w:tab w:val="num" w:pos="2160"/>
+        </w:tabs>
+        <w:ind w:left="2160" w:hanging="360"/>
+      </w:pPr>
+      <w:rPr>
+        <w:rFonts w:ascii="Wingdings" w:hAnsi="Wingdings" w:hint="default"/>
+        <w:sz w:val="20"/>
+      </w:rPr>
+    </w:lvl>
+    <w:lvl w:ilvl="3" w:tentative="1">
+      <w:start w:val="1"/>
+      <w:numFmt w:val="bullet"/>
+      <w:lvlText w:val=""/>
+      <w:lvlJc w:val="left"/>
+      <w:pPr>
+        <w:tabs>
+          <w:tab w:val="num" w:pos="2880"/>
+        </w:tabs>
+        <w:ind w:left="2880" w:hanging="360"/>
+      </w:pPr>
+      <w:rPr>
+        <w:rFonts w:ascii="Wingdings" w:hAnsi="Wingdings" w:hint="default"/>
+        <w:sz w:val="20"/>
+      </w:rPr>
+    </w:lvl>
+    <w:lvl w:ilvl="4" w:tentative="1">
+      <w:start w:val="1"/>
+      <w:numFmt w:val="bullet"/>
+      <w:lvlText w:val=""/>
+      <w:lvlJc w:val="left"/>
+      <w:pPr>
+        <w:tabs>
+          <w:tab w:val="num" w:pos="3600"/>
+        </w:tabs>
+        <w:ind w:left="3600" w:hanging="360"/>
+      </w:pPr>
+      <w:rPr>
+        <w:rFonts w:ascii="Wingdings" w:hAnsi="Wingdings" w:hint="default"/>
+        <w:sz w:val="20"/>
+      </w:rPr>
+    </w:lvl>
+    <w:lvl w:ilvl="5" w:tentative="1">
+      <w:start w:val="1"/>
+      <w:numFmt w:val="bullet"/>
+      <w:lvlText w:val=""/>
+      <w:lvlJc w:val="left"/>
+      <w:pPr>
+        <w:tabs>
+          <w:tab w:val="num" w:pos="4320"/>
+        </w:tabs>
+        <w:ind w:left="4320" w:hanging="360"/>
+      </w:pPr>
+      <w:rPr>
+        <w:rFonts w:ascii="Wingdings" w:hAnsi="Wingdings" w:hint="default"/>
+        <w:sz w:val="20"/>
+      </w:rPr>
+    </w:lvl>
+    <w:lvl w:ilvl="6" w:tentative="1">
+      <w:start w:val="1"/>
+      <w:numFmt w:val="bullet"/>
+      <w:lvlText w:val=""/>
+      <w:lvlJc w:val="left"/>
+      <w:pPr>
+        <w:tabs>
+          <w:tab w:val="num" w:pos="5040"/>
+        </w:tabs>
+        <w:ind w:left="5040" w:hanging="360"/>
+      </w:pPr>
+      <w:rPr>
+        <w:rFonts w:ascii="Wingdings" w:hAnsi="Wingdings" w:hint="default"/>
+        <w:sz w:val="20"/>
+      </w:rPr>
+    </w:lvl>
+    <w:lvl w:ilvl="7" w:tentative="1">
+      <w:start w:val="1"/>
+      <w:numFmt w:val="bullet"/>
+      <w:lvlText w:val=""/>
+      <w:lvlJc w:val="left"/>
+      <w:pPr>
+        <w:tabs>
+          <w:tab w:val="num" w:pos="5760"/>
+        </w:tabs>
+        <w:ind w:left="5760" w:hanging="360"/>
+      </w:pPr>
+      <w:rPr>
+        <w:rFonts w:ascii="Wingdings" w:hAnsi="Wingdings" w:hint="default"/>
+        <w:sz w:val="20"/>
+      </w:rPr>
+    </w:lvl>
+    <w:lvl w:ilvl="8" w:tentative="1">
+      <w:start w:val="1"/>
+      <w:numFmt w:val="bullet"/>
+      <w:lvlText w:val=""/>
+      <w:lvlJc w:val="left"/>
+      <w:pPr>
+        <w:tabs>
+          <w:tab w:val="num" w:pos="6480"/>
+        </w:tabs>
+        <w:ind w:left="6480" w:hanging="360"/>
+      </w:pPr>
+      <w:rPr>
+        <w:rFonts w:ascii="Wingdings" w:hAnsi="Wingdings" w:hint="default"/>
+        <w:sz w:val="20"/>
+      </w:rPr>
+    </w:lvl>
+  </w:abstractNum>
+  <w:abstractNum w:abstractNumId="4" w15:restartNumberingAfterBreak="0">
+    <w:nsid w:val="23E65E31"/>
+    <w:multiLevelType w:val="multilevel"/>
+    <w:tmpl w:val="90767702"/>
+    <w:lvl w:ilvl="0">
+      <w:start w:val="1"/>
+      <w:numFmt w:val="bullet"/>
+      <w:lvlText w:val=""/>
+      <w:lvlJc w:val="left"/>
+      <w:pPr>
+        <w:tabs>
+          <w:tab w:val="num" w:pos="720"/>
+        </w:tabs>
+        <w:ind w:left="720" w:hanging="360"/>
+      </w:pPr>
+      <w:rPr>
+        <w:rFonts w:ascii="Symbol" w:hAnsi="Symbol" w:hint="default"/>
+        <w:sz w:val="20"/>
+      </w:rPr>
+    </w:lvl>
+    <w:lvl w:ilvl="1" w:tentative="1">
+      <w:start w:val="1"/>
+      <w:numFmt w:val="bullet"/>
+      <w:lvlText w:val="o"/>
+      <w:lvlJc w:val="left"/>
+      <w:pPr>
+        <w:tabs>
+          <w:tab w:val="num" w:pos="1440"/>
+        </w:tabs>
+        <w:ind w:left="1440" w:hanging="360"/>
+      </w:pPr>
+      <w:rPr>
+        <w:rFonts w:ascii="Courier New" w:hAnsi="Courier New" w:hint="default"/>
+        <w:sz w:val="20"/>
+      </w:rPr>
+    </w:lvl>
+    <w:lvl w:ilvl="2" w:tentative="1">
+      <w:start w:val="1"/>
+      <w:numFmt w:val="bullet"/>
+      <w:lvlText w:val=""/>
+      <w:lvlJc w:val="left"/>
+      <w:pPr>
+        <w:tabs>
+          <w:tab w:val="num" w:pos="2160"/>
+        </w:tabs>
+        <w:ind w:left="2160" w:hanging="360"/>
+      </w:pPr>
+      <w:rPr>
+        <w:rFonts w:ascii="Wingdings" w:hAnsi="Wingdings" w:hint="default"/>
+        <w:sz w:val="20"/>
+      </w:rPr>
+    </w:lvl>
+    <w:lvl w:ilvl="3" w:tentative="1">
+      <w:start w:val="1"/>
+      <w:numFmt w:val="bullet"/>
+      <w:lvlText w:val=""/>
+      <w:lvlJc w:val="left"/>
+      <w:pPr>
+        <w:tabs>
+          <w:tab w:val="num" w:pos="2880"/>
+        </w:tabs>
+        <w:ind w:left="2880" w:hanging="360"/>
+      </w:pPr>
+      <w:rPr>
+        <w:rFonts w:ascii="Wingdings" w:hAnsi="Wingdings" w:hint="default"/>
+        <w:sz w:val="20"/>
+      </w:rPr>
+    </w:lvl>
+    <w:lvl w:ilvl="4" w:tentative="1">
+      <w:start w:val="1"/>
+      <w:numFmt w:val="bullet"/>
+      <w:lvlText w:val=""/>
+      <w:lvlJc w:val="left"/>
+      <w:pPr>
+        <w:tabs>
+          <w:tab w:val="num" w:pos="3600"/>
+        </w:tabs>
+        <w:ind w:left="3600" w:hanging="360"/>
+      </w:pPr>
+      <w:rPr>
+        <w:rFonts w:ascii="Wingdings" w:hAnsi="Wingdings" w:hint="default"/>
+        <w:sz w:val="20"/>
+      </w:rPr>
+    </w:lvl>
+    <w:lvl w:ilvl="5" w:tentative="1">
+      <w:start w:val="1"/>
+      <w:numFmt w:val="bullet"/>
+      <w:lvlText w:val=""/>
+      <w:lvlJc w:val="left"/>
+      <w:pPr>
+        <w:tabs>
+          <w:tab w:val="num" w:pos="4320"/>
+        </w:tabs>
+        <w:ind w:left="4320" w:hanging="360"/>
+      </w:pPr>
+      <w:rPr>
+        <w:rFonts w:ascii="Wingdings" w:hAnsi="Wingdings" w:hint="default"/>
+        <w:sz w:val="20"/>
+      </w:rPr>
+    </w:lvl>
+    <w:lvl w:ilvl="6" w:tentative="1">
+      <w:start w:val="1"/>
+      <w:numFmt w:val="bullet"/>
+      <w:lvlText w:val=""/>
+      <w:lvlJc w:val="left"/>
+      <w:pPr>
+        <w:tabs>
+          <w:tab w:val="num" w:pos="5040"/>
+        </w:tabs>
+        <w:ind w:left="5040" w:hanging="360"/>
+      </w:pPr>
+      <w:rPr>
+        <w:rFonts w:ascii="Wingdings" w:hAnsi="Wingdings" w:hint="default"/>
+        <w:sz w:val="20"/>
+      </w:rPr>
+    </w:lvl>
+    <w:lvl w:ilvl="7" w:tentative="1">
+      <w:start w:val="1"/>
+      <w:numFmt w:val="bullet"/>
+      <w:lvlText w:val=""/>
+      <w:lvlJc w:val="left"/>
+      <w:pPr>
+        <w:tabs>
+          <w:tab w:val="num" w:pos="5760"/>
+        </w:tabs>
+        <w:ind w:left="5760" w:hanging="360"/>
+      </w:pPr>
+      <w:rPr>
+        <w:rFonts w:ascii="Wingdings" w:hAnsi="Wingdings" w:hint="default"/>
+        <w:sz w:val="20"/>
+      </w:rPr>
+    </w:lvl>
+    <w:lvl w:ilvl="8" w:tentative="1">
+      <w:start w:val="1"/>
+      <w:numFmt w:val="bullet"/>
+      <w:lvlText w:val=""/>
+      <w:lvlJc w:val="left"/>
+      <w:pPr>
+        <w:tabs>
+          <w:tab w:val="num" w:pos="6480"/>
+        </w:tabs>
+        <w:ind w:left="6480" w:hanging="360"/>
+      </w:pPr>
+      <w:rPr>
+        <w:rFonts w:ascii="Wingdings" w:hAnsi="Wingdings" w:hint="default"/>
+        <w:sz w:val="20"/>
+      </w:rPr>
+    </w:lvl>
+  </w:abstractNum>
+  <w:abstractNum w:abstractNumId="5" w15:restartNumberingAfterBreak="0">
     <w:nsid w:val="2A8D30F5"/>
     <w:multiLevelType w:val="multilevel"/>
     <w:tmpl w:val="E85CB43C"/>
@@ -2358,7 +3767,454 @@
       </w:rPr>
     </w:lvl>
   </w:abstractNum>
-  <w:abstractNum w:abstractNumId="2" w15:restartNumberingAfterBreak="0">
+  <w:abstractNum w:abstractNumId="6" w15:restartNumberingAfterBreak="0">
+    <w:nsid w:val="2D1E0BFB"/>
+    <w:multiLevelType w:val="multilevel"/>
+    <w:tmpl w:val="812E58C6"/>
+    <w:lvl w:ilvl="0">
+      <w:start w:val="1"/>
+      <w:numFmt w:val="bullet"/>
+      <w:lvlText w:val=""/>
+      <w:lvlJc w:val="left"/>
+      <w:pPr>
+        <w:tabs>
+          <w:tab w:val="num" w:pos="720"/>
+        </w:tabs>
+        <w:ind w:left="720" w:hanging="360"/>
+      </w:pPr>
+      <w:rPr>
+        <w:rFonts w:ascii="Symbol" w:hAnsi="Symbol" w:hint="default"/>
+        <w:sz w:val="20"/>
+      </w:rPr>
+    </w:lvl>
+    <w:lvl w:ilvl="1" w:tentative="1">
+      <w:start w:val="1"/>
+      <w:numFmt w:val="bullet"/>
+      <w:lvlText w:val="o"/>
+      <w:lvlJc w:val="left"/>
+      <w:pPr>
+        <w:tabs>
+          <w:tab w:val="num" w:pos="1440"/>
+        </w:tabs>
+        <w:ind w:left="1440" w:hanging="360"/>
+      </w:pPr>
+      <w:rPr>
+        <w:rFonts w:ascii="Courier New" w:hAnsi="Courier New" w:hint="default"/>
+        <w:sz w:val="20"/>
+      </w:rPr>
+    </w:lvl>
+    <w:lvl w:ilvl="2" w:tentative="1">
+      <w:start w:val="1"/>
+      <w:numFmt w:val="bullet"/>
+      <w:lvlText w:val=""/>
+      <w:lvlJc w:val="left"/>
+      <w:pPr>
+        <w:tabs>
+          <w:tab w:val="num" w:pos="2160"/>
+        </w:tabs>
+        <w:ind w:left="2160" w:hanging="360"/>
+      </w:pPr>
+      <w:rPr>
+        <w:rFonts w:ascii="Wingdings" w:hAnsi="Wingdings" w:hint="default"/>
+        <w:sz w:val="20"/>
+      </w:rPr>
+    </w:lvl>
+    <w:lvl w:ilvl="3" w:tentative="1">
+      <w:start w:val="1"/>
+      <w:numFmt w:val="bullet"/>
+      <w:lvlText w:val=""/>
+      <w:lvlJc w:val="left"/>
+      <w:pPr>
+        <w:tabs>
+          <w:tab w:val="num" w:pos="2880"/>
+        </w:tabs>
+        <w:ind w:left="2880" w:hanging="360"/>
+      </w:pPr>
+      <w:rPr>
+        <w:rFonts w:ascii="Wingdings" w:hAnsi="Wingdings" w:hint="default"/>
+        <w:sz w:val="20"/>
+      </w:rPr>
+    </w:lvl>
+    <w:lvl w:ilvl="4" w:tentative="1">
+      <w:start w:val="1"/>
+      <w:numFmt w:val="bullet"/>
+      <w:lvlText w:val=""/>
+      <w:lvlJc w:val="left"/>
+      <w:pPr>
+        <w:tabs>
+          <w:tab w:val="num" w:pos="3600"/>
+        </w:tabs>
+        <w:ind w:left="3600" w:hanging="360"/>
+      </w:pPr>
+      <w:rPr>
+        <w:rFonts w:ascii="Wingdings" w:hAnsi="Wingdings" w:hint="default"/>
+        <w:sz w:val="20"/>
+      </w:rPr>
+    </w:lvl>
+    <w:lvl w:ilvl="5" w:tentative="1">
+      <w:start w:val="1"/>
+      <w:numFmt w:val="bullet"/>
+      <w:lvlText w:val=""/>
+      <w:lvlJc w:val="left"/>
+      <w:pPr>
+        <w:tabs>
+          <w:tab w:val="num" w:pos="4320"/>
+        </w:tabs>
+        <w:ind w:left="4320" w:hanging="360"/>
+      </w:pPr>
+      <w:rPr>
+        <w:rFonts w:ascii="Wingdings" w:hAnsi="Wingdings" w:hint="default"/>
+        <w:sz w:val="20"/>
+      </w:rPr>
+    </w:lvl>
+    <w:lvl w:ilvl="6" w:tentative="1">
+      <w:start w:val="1"/>
+      <w:numFmt w:val="bullet"/>
+      <w:lvlText w:val=""/>
+      <w:lvlJc w:val="left"/>
+      <w:pPr>
+        <w:tabs>
+          <w:tab w:val="num" w:pos="5040"/>
+        </w:tabs>
+        <w:ind w:left="5040" w:hanging="360"/>
+      </w:pPr>
+      <w:rPr>
+        <w:rFonts w:ascii="Wingdings" w:hAnsi="Wingdings" w:hint="default"/>
+        <w:sz w:val="20"/>
+      </w:rPr>
+    </w:lvl>
+    <w:lvl w:ilvl="7" w:tentative="1">
+      <w:start w:val="1"/>
+      <w:numFmt w:val="bullet"/>
+      <w:lvlText w:val=""/>
+      <w:lvlJc w:val="left"/>
+      <w:pPr>
+        <w:tabs>
+          <w:tab w:val="num" w:pos="5760"/>
+        </w:tabs>
+        <w:ind w:left="5760" w:hanging="360"/>
+      </w:pPr>
+      <w:rPr>
+        <w:rFonts w:ascii="Wingdings" w:hAnsi="Wingdings" w:hint="default"/>
+        <w:sz w:val="20"/>
+      </w:rPr>
+    </w:lvl>
+    <w:lvl w:ilvl="8" w:tentative="1">
+      <w:start w:val="1"/>
+      <w:numFmt w:val="bullet"/>
+      <w:lvlText w:val=""/>
+      <w:lvlJc w:val="left"/>
+      <w:pPr>
+        <w:tabs>
+          <w:tab w:val="num" w:pos="6480"/>
+        </w:tabs>
+        <w:ind w:left="6480" w:hanging="360"/>
+      </w:pPr>
+      <w:rPr>
+        <w:rFonts w:ascii="Wingdings" w:hAnsi="Wingdings" w:hint="default"/>
+        <w:sz w:val="20"/>
+      </w:rPr>
+    </w:lvl>
+  </w:abstractNum>
+  <w:abstractNum w:abstractNumId="7" w15:restartNumberingAfterBreak="0">
+    <w:nsid w:val="2D9311C8"/>
+    <w:multiLevelType w:val="multilevel"/>
+    <w:tmpl w:val="99305F68"/>
+    <w:lvl w:ilvl="0">
+      <w:start w:val="1"/>
+      <w:numFmt w:val="bullet"/>
+      <w:lvlText w:val=""/>
+      <w:lvlJc w:val="left"/>
+      <w:pPr>
+        <w:tabs>
+          <w:tab w:val="num" w:pos="720"/>
+        </w:tabs>
+        <w:ind w:left="720" w:hanging="360"/>
+      </w:pPr>
+      <w:rPr>
+        <w:rFonts w:ascii="Symbol" w:hAnsi="Symbol" w:hint="default"/>
+        <w:sz w:val="20"/>
+      </w:rPr>
+    </w:lvl>
+    <w:lvl w:ilvl="1" w:tentative="1">
+      <w:start w:val="1"/>
+      <w:numFmt w:val="bullet"/>
+      <w:lvlText w:val="o"/>
+      <w:lvlJc w:val="left"/>
+      <w:pPr>
+        <w:tabs>
+          <w:tab w:val="num" w:pos="1440"/>
+        </w:tabs>
+        <w:ind w:left="1440" w:hanging="360"/>
+      </w:pPr>
+      <w:rPr>
+        <w:rFonts w:ascii="Courier New" w:hAnsi="Courier New" w:hint="default"/>
+        <w:sz w:val="20"/>
+      </w:rPr>
+    </w:lvl>
+    <w:lvl w:ilvl="2" w:tentative="1">
+      <w:start w:val="1"/>
+      <w:numFmt w:val="bullet"/>
+      <w:lvlText w:val=""/>
+      <w:lvlJc w:val="left"/>
+      <w:pPr>
+        <w:tabs>
+          <w:tab w:val="num" w:pos="2160"/>
+        </w:tabs>
+        <w:ind w:left="2160" w:hanging="360"/>
+      </w:pPr>
+      <w:rPr>
+        <w:rFonts w:ascii="Wingdings" w:hAnsi="Wingdings" w:hint="default"/>
+        <w:sz w:val="20"/>
+      </w:rPr>
+    </w:lvl>
+    <w:lvl w:ilvl="3" w:tentative="1">
+      <w:start w:val="1"/>
+      <w:numFmt w:val="bullet"/>
+      <w:lvlText w:val=""/>
+      <w:lvlJc w:val="left"/>
+      <w:pPr>
+        <w:tabs>
+          <w:tab w:val="num" w:pos="2880"/>
+        </w:tabs>
+        <w:ind w:left="2880" w:hanging="360"/>
+      </w:pPr>
+      <w:rPr>
+        <w:rFonts w:ascii="Wingdings" w:hAnsi="Wingdings" w:hint="default"/>
+        <w:sz w:val="20"/>
+      </w:rPr>
+    </w:lvl>
+    <w:lvl w:ilvl="4" w:tentative="1">
+      <w:start w:val="1"/>
+      <w:numFmt w:val="bullet"/>
+      <w:lvlText w:val=""/>
+      <w:lvlJc w:val="left"/>
+      <w:pPr>
+        <w:tabs>
+          <w:tab w:val="num" w:pos="3600"/>
+        </w:tabs>
+        <w:ind w:left="3600" w:hanging="360"/>
+      </w:pPr>
+      <w:rPr>
+        <w:rFonts w:ascii="Wingdings" w:hAnsi="Wingdings" w:hint="default"/>
+        <w:sz w:val="20"/>
+      </w:rPr>
+    </w:lvl>
+    <w:lvl w:ilvl="5" w:tentative="1">
+      <w:start w:val="1"/>
+      <w:numFmt w:val="bullet"/>
+      <w:lvlText w:val=""/>
+      <w:lvlJc w:val="left"/>
+      <w:pPr>
+        <w:tabs>
+          <w:tab w:val="num" w:pos="4320"/>
+        </w:tabs>
+        <w:ind w:left="4320" w:hanging="360"/>
+      </w:pPr>
+      <w:rPr>
+        <w:rFonts w:ascii="Wingdings" w:hAnsi="Wingdings" w:hint="default"/>
+        <w:sz w:val="20"/>
+      </w:rPr>
+    </w:lvl>
+    <w:lvl w:ilvl="6" w:tentative="1">
+      <w:start w:val="1"/>
+      <w:numFmt w:val="bullet"/>
+      <w:lvlText w:val=""/>
+      <w:lvlJc w:val="left"/>
+      <w:pPr>
+        <w:tabs>
+          <w:tab w:val="num" w:pos="5040"/>
+        </w:tabs>
+        <w:ind w:left="5040" w:hanging="360"/>
+      </w:pPr>
+      <w:rPr>
+        <w:rFonts w:ascii="Wingdings" w:hAnsi="Wingdings" w:hint="default"/>
+        <w:sz w:val="20"/>
+      </w:rPr>
+    </w:lvl>
+    <w:lvl w:ilvl="7" w:tentative="1">
+      <w:start w:val="1"/>
+      <w:numFmt w:val="bullet"/>
+      <w:lvlText w:val=""/>
+      <w:lvlJc w:val="left"/>
+      <w:pPr>
+        <w:tabs>
+          <w:tab w:val="num" w:pos="5760"/>
+        </w:tabs>
+        <w:ind w:left="5760" w:hanging="360"/>
+      </w:pPr>
+      <w:rPr>
+        <w:rFonts w:ascii="Wingdings" w:hAnsi="Wingdings" w:hint="default"/>
+        <w:sz w:val="20"/>
+      </w:rPr>
+    </w:lvl>
+    <w:lvl w:ilvl="8" w:tentative="1">
+      <w:start w:val="1"/>
+      <w:numFmt w:val="bullet"/>
+      <w:lvlText w:val=""/>
+      <w:lvlJc w:val="left"/>
+      <w:pPr>
+        <w:tabs>
+          <w:tab w:val="num" w:pos="6480"/>
+        </w:tabs>
+        <w:ind w:left="6480" w:hanging="360"/>
+      </w:pPr>
+      <w:rPr>
+        <w:rFonts w:ascii="Wingdings" w:hAnsi="Wingdings" w:hint="default"/>
+        <w:sz w:val="20"/>
+      </w:rPr>
+    </w:lvl>
+  </w:abstractNum>
+  <w:abstractNum w:abstractNumId="8" w15:restartNumberingAfterBreak="0">
+    <w:nsid w:val="476D5D4A"/>
+    <w:multiLevelType w:val="multilevel"/>
+    <w:tmpl w:val="3AA2DF0E"/>
+    <w:lvl w:ilvl="0">
+      <w:start w:val="1"/>
+      <w:numFmt w:val="bullet"/>
+      <w:lvlText w:val=""/>
+      <w:lvlJc w:val="left"/>
+      <w:pPr>
+        <w:tabs>
+          <w:tab w:val="num" w:pos="720"/>
+        </w:tabs>
+        <w:ind w:left="720" w:hanging="360"/>
+      </w:pPr>
+      <w:rPr>
+        <w:rFonts w:ascii="Symbol" w:hAnsi="Symbol" w:hint="default"/>
+        <w:sz w:val="20"/>
+      </w:rPr>
+    </w:lvl>
+    <w:lvl w:ilvl="1" w:tentative="1">
+      <w:start w:val="1"/>
+      <w:numFmt w:val="bullet"/>
+      <w:lvlText w:val="o"/>
+      <w:lvlJc w:val="left"/>
+      <w:pPr>
+        <w:tabs>
+          <w:tab w:val="num" w:pos="1440"/>
+        </w:tabs>
+        <w:ind w:left="1440" w:hanging="360"/>
+      </w:pPr>
+      <w:rPr>
+        <w:rFonts w:ascii="Courier New" w:hAnsi="Courier New" w:hint="default"/>
+        <w:sz w:val="20"/>
+      </w:rPr>
+    </w:lvl>
+    <w:lvl w:ilvl="2" w:tentative="1">
+      <w:start w:val="1"/>
+      <w:numFmt w:val="bullet"/>
+      <w:lvlText w:val=""/>
+      <w:lvlJc w:val="left"/>
+      <w:pPr>
+        <w:tabs>
+          <w:tab w:val="num" w:pos="2160"/>
+        </w:tabs>
+        <w:ind w:left="2160" w:hanging="360"/>
+      </w:pPr>
+      <w:rPr>
+        <w:rFonts w:ascii="Wingdings" w:hAnsi="Wingdings" w:hint="default"/>
+        <w:sz w:val="20"/>
+      </w:rPr>
+    </w:lvl>
+    <w:lvl w:ilvl="3" w:tentative="1">
+      <w:start w:val="1"/>
+      <w:numFmt w:val="bullet"/>
+      <w:lvlText w:val=""/>
+      <w:lvlJc w:val="left"/>
+      <w:pPr>
+        <w:tabs>
+          <w:tab w:val="num" w:pos="2880"/>
+        </w:tabs>
+        <w:ind w:left="2880" w:hanging="360"/>
+      </w:pPr>
+      <w:rPr>
+        <w:rFonts w:ascii="Wingdings" w:hAnsi="Wingdings" w:hint="default"/>
+        <w:sz w:val="20"/>
+      </w:rPr>
+    </w:lvl>
+    <w:lvl w:ilvl="4" w:tentative="1">
+      <w:start w:val="1"/>
+      <w:numFmt w:val="bullet"/>
+      <w:lvlText w:val=""/>
+      <w:lvlJc w:val="left"/>
+      <w:pPr>
+        <w:tabs>
+          <w:tab w:val="num" w:pos="3600"/>
+        </w:tabs>
+        <w:ind w:left="3600" w:hanging="360"/>
+      </w:pPr>
+      <w:rPr>
+        <w:rFonts w:ascii="Wingdings" w:hAnsi="Wingdings" w:hint="default"/>
+        <w:sz w:val="20"/>
+      </w:rPr>
+    </w:lvl>
+    <w:lvl w:ilvl="5" w:tentative="1">
+      <w:start w:val="1"/>
+      <w:numFmt w:val="bullet"/>
+      <w:lvlText w:val=""/>
+      <w:lvlJc w:val="left"/>
+      <w:pPr>
+        <w:tabs>
+          <w:tab w:val="num" w:pos="4320"/>
+        </w:tabs>
+        <w:ind w:left="4320" w:hanging="360"/>
+      </w:pPr>
+      <w:rPr>
+        <w:rFonts w:ascii="Wingdings" w:hAnsi="Wingdings" w:hint="default"/>
+        <w:sz w:val="20"/>
+      </w:rPr>
+    </w:lvl>
+    <w:lvl w:ilvl="6" w:tentative="1">
+      <w:start w:val="1"/>
+      <w:numFmt w:val="bullet"/>
+      <w:lvlText w:val=""/>
+      <w:lvlJc w:val="left"/>
+      <w:pPr>
+        <w:tabs>
+          <w:tab w:val="num" w:pos="5040"/>
+        </w:tabs>
+        <w:ind w:left="5040" w:hanging="360"/>
+      </w:pPr>
+      <w:rPr>
+        <w:rFonts w:ascii="Wingdings" w:hAnsi="Wingdings" w:hint="default"/>
+        <w:sz w:val="20"/>
+      </w:rPr>
+    </w:lvl>
+    <w:lvl w:ilvl="7" w:tentative="1">
+      <w:start w:val="1"/>
+      <w:numFmt w:val="bullet"/>
+      <w:lvlText w:val=""/>
+      <w:lvlJc w:val="left"/>
+      <w:pPr>
+        <w:tabs>
+          <w:tab w:val="num" w:pos="5760"/>
+        </w:tabs>
+        <w:ind w:left="5760" w:hanging="360"/>
+      </w:pPr>
+      <w:rPr>
+        <w:rFonts w:ascii="Wingdings" w:hAnsi="Wingdings" w:hint="default"/>
+        <w:sz w:val="20"/>
+      </w:rPr>
+    </w:lvl>
+    <w:lvl w:ilvl="8" w:tentative="1">
+      <w:start w:val="1"/>
+      <w:numFmt w:val="bullet"/>
+      <w:lvlText w:val=""/>
+      <w:lvlJc w:val="left"/>
+      <w:pPr>
+        <w:tabs>
+          <w:tab w:val="num" w:pos="6480"/>
+        </w:tabs>
+        <w:ind w:left="6480" w:hanging="360"/>
+      </w:pPr>
+      <w:rPr>
+        <w:rFonts w:ascii="Wingdings" w:hAnsi="Wingdings" w:hint="default"/>
+        <w:sz w:val="20"/>
+      </w:rPr>
+    </w:lvl>
+  </w:abstractNum>
+  <w:abstractNum w:abstractNumId="9" w15:restartNumberingAfterBreak="0">
     <w:nsid w:val="5E6350D7"/>
     <w:multiLevelType w:val="hybridMultilevel"/>
     <w:tmpl w:val="209A1418"/>
@@ -2471,14 +4327,187 @@
       </w:rPr>
     </w:lvl>
   </w:abstractNum>
+  <w:abstractNum w:abstractNumId="10" w15:restartNumberingAfterBreak="0">
+    <w:nsid w:val="74732A92"/>
+    <w:multiLevelType w:val="multilevel"/>
+    <w:tmpl w:val="BC7EBE28"/>
+    <w:lvl w:ilvl="0">
+      <w:start w:val="1"/>
+      <w:numFmt w:val="bullet"/>
+      <w:lvlText w:val=""/>
+      <w:lvlJc w:val="left"/>
+      <w:pPr>
+        <w:tabs>
+          <w:tab w:val="num" w:pos="720"/>
+        </w:tabs>
+        <w:ind w:left="720" w:hanging="360"/>
+      </w:pPr>
+      <w:rPr>
+        <w:rFonts w:ascii="Symbol" w:hAnsi="Symbol" w:hint="default"/>
+        <w:sz w:val="20"/>
+      </w:rPr>
+    </w:lvl>
+    <w:lvl w:ilvl="1" w:tentative="1">
+      <w:start w:val="1"/>
+      <w:numFmt w:val="bullet"/>
+      <w:lvlText w:val="o"/>
+      <w:lvlJc w:val="left"/>
+      <w:pPr>
+        <w:tabs>
+          <w:tab w:val="num" w:pos="1440"/>
+        </w:tabs>
+        <w:ind w:left="1440" w:hanging="360"/>
+      </w:pPr>
+      <w:rPr>
+        <w:rFonts w:ascii="Courier New" w:hAnsi="Courier New" w:hint="default"/>
+        <w:sz w:val="20"/>
+      </w:rPr>
+    </w:lvl>
+    <w:lvl w:ilvl="2" w:tentative="1">
+      <w:start w:val="1"/>
+      <w:numFmt w:val="bullet"/>
+      <w:lvlText w:val=""/>
+      <w:lvlJc w:val="left"/>
+      <w:pPr>
+        <w:tabs>
+          <w:tab w:val="num" w:pos="2160"/>
+        </w:tabs>
+        <w:ind w:left="2160" w:hanging="360"/>
+      </w:pPr>
+      <w:rPr>
+        <w:rFonts w:ascii="Wingdings" w:hAnsi="Wingdings" w:hint="default"/>
+        <w:sz w:val="20"/>
+      </w:rPr>
+    </w:lvl>
+    <w:lvl w:ilvl="3" w:tentative="1">
+      <w:start w:val="1"/>
+      <w:numFmt w:val="bullet"/>
+      <w:lvlText w:val=""/>
+      <w:lvlJc w:val="left"/>
+      <w:pPr>
+        <w:tabs>
+          <w:tab w:val="num" w:pos="2880"/>
+        </w:tabs>
+        <w:ind w:left="2880" w:hanging="360"/>
+      </w:pPr>
+      <w:rPr>
+        <w:rFonts w:ascii="Wingdings" w:hAnsi="Wingdings" w:hint="default"/>
+        <w:sz w:val="20"/>
+      </w:rPr>
+    </w:lvl>
+    <w:lvl w:ilvl="4" w:tentative="1">
+      <w:start w:val="1"/>
+      <w:numFmt w:val="bullet"/>
+      <w:lvlText w:val=""/>
+      <w:lvlJc w:val="left"/>
+      <w:pPr>
+        <w:tabs>
+          <w:tab w:val="num" w:pos="3600"/>
+        </w:tabs>
+        <w:ind w:left="3600" w:hanging="360"/>
+      </w:pPr>
+      <w:rPr>
+        <w:rFonts w:ascii="Wingdings" w:hAnsi="Wingdings" w:hint="default"/>
+        <w:sz w:val="20"/>
+      </w:rPr>
+    </w:lvl>
+    <w:lvl w:ilvl="5" w:tentative="1">
+      <w:start w:val="1"/>
+      <w:numFmt w:val="bullet"/>
+      <w:lvlText w:val=""/>
+      <w:lvlJc w:val="left"/>
+      <w:pPr>
+        <w:tabs>
+          <w:tab w:val="num" w:pos="4320"/>
+        </w:tabs>
+        <w:ind w:left="4320" w:hanging="360"/>
+      </w:pPr>
+      <w:rPr>
+        <w:rFonts w:ascii="Wingdings" w:hAnsi="Wingdings" w:hint="default"/>
+        <w:sz w:val="20"/>
+      </w:rPr>
+    </w:lvl>
+    <w:lvl w:ilvl="6" w:tentative="1">
+      <w:start w:val="1"/>
+      <w:numFmt w:val="bullet"/>
+      <w:lvlText w:val=""/>
+      <w:lvlJc w:val="left"/>
+      <w:pPr>
+        <w:tabs>
+          <w:tab w:val="num" w:pos="5040"/>
+        </w:tabs>
+        <w:ind w:left="5040" w:hanging="360"/>
+      </w:pPr>
+      <w:rPr>
+        <w:rFonts w:ascii="Wingdings" w:hAnsi="Wingdings" w:hint="default"/>
+        <w:sz w:val="20"/>
+      </w:rPr>
+    </w:lvl>
+    <w:lvl w:ilvl="7" w:tentative="1">
+      <w:start w:val="1"/>
+      <w:numFmt w:val="bullet"/>
+      <w:lvlText w:val=""/>
+      <w:lvlJc w:val="left"/>
+      <w:pPr>
+        <w:tabs>
+          <w:tab w:val="num" w:pos="5760"/>
+        </w:tabs>
+        <w:ind w:left="5760" w:hanging="360"/>
+      </w:pPr>
+      <w:rPr>
+        <w:rFonts w:ascii="Wingdings" w:hAnsi="Wingdings" w:hint="default"/>
+        <w:sz w:val="20"/>
+      </w:rPr>
+    </w:lvl>
+    <w:lvl w:ilvl="8" w:tentative="1">
+      <w:start w:val="1"/>
+      <w:numFmt w:val="bullet"/>
+      <w:lvlText w:val=""/>
+      <w:lvlJc w:val="left"/>
+      <w:pPr>
+        <w:tabs>
+          <w:tab w:val="num" w:pos="6480"/>
+        </w:tabs>
+        <w:ind w:left="6480" w:hanging="360"/>
+      </w:pPr>
+      <w:rPr>
+        <w:rFonts w:ascii="Wingdings" w:hAnsi="Wingdings" w:hint="default"/>
+        <w:sz w:val="20"/>
+      </w:rPr>
+    </w:lvl>
+  </w:abstractNum>
   <w:num w:numId="1" w16cid:durableId="1278440984">
-    <w:abstractNumId w:val="1"/>
+    <w:abstractNumId w:val="5"/>
   </w:num>
   <w:num w:numId="2" w16cid:durableId="1738671991">
     <w:abstractNumId w:val="0"/>
   </w:num>
   <w:num w:numId="3" w16cid:durableId="620305038">
+    <w:abstractNumId w:val="9"/>
+  </w:num>
+  <w:num w:numId="4" w16cid:durableId="1182940569">
+    <w:abstractNumId w:val="7"/>
+  </w:num>
+  <w:num w:numId="5" w16cid:durableId="1638684074">
+    <w:abstractNumId w:val="8"/>
+  </w:num>
+  <w:num w:numId="6" w16cid:durableId="34084090">
+    <w:abstractNumId w:val="6"/>
+  </w:num>
+  <w:num w:numId="7" w16cid:durableId="1256599912">
+    <w:abstractNumId w:val="10"/>
+  </w:num>
+  <w:num w:numId="8" w16cid:durableId="1878394427">
     <w:abstractNumId w:val="2"/>
+  </w:num>
+  <w:num w:numId="9" w16cid:durableId="107815761">
+    <w:abstractNumId w:val="4"/>
+  </w:num>
+  <w:num w:numId="10" w16cid:durableId="1118569943">
+    <w:abstractNumId w:val="3"/>
+  </w:num>
+  <w:num w:numId="11" w16cid:durableId="1307853845">
+    <w:abstractNumId w:val="1"/>
   </w:num>
 </w:numbering>
 </file>
@@ -2955,7 +4984,6 @@
     <w:next w:val="Normal"/>
     <w:link w:val="Heading4Char"/>
     <w:uiPriority w:val="9"/>
-    <w:semiHidden/>
     <w:unhideWhenUsed/>
     <w:qFormat/>
     <w:rsid w:val="00E5158E"/>
@@ -3084,7 +5112,6 @@
   <w:style w:type="character" w:default="1" w:styleId="DefaultParagraphFont">
     <w:name w:val="Default Paragraph Font"/>
     <w:uiPriority w:val="1"/>
-    <w:semiHidden/>
     <w:unhideWhenUsed/>
   </w:style>
   <w:style w:type="table" w:default="1" w:styleId="TableNormal">
@@ -3152,7 +5179,6 @@
     <w:basedOn w:val="DefaultParagraphFont"/>
     <w:link w:val="Heading4"/>
     <w:uiPriority w:val="9"/>
-    <w:semiHidden/>
     <w:rsid w:val="00E5158E"/>
     <w:rPr>
       <w:rFonts w:eastAsiaTheme="majorEastAsia" w:cstheme="majorBidi"/>
@@ -3448,6 +5474,17 @@
     <w:rPr>
       <w:color w:val="96607D" w:themeColor="followedHyperlink"/>
       <w:u w:val="single"/>
+    </w:rPr>
+  </w:style>
+  <w:style w:type="paragraph" w:styleId="NormalWeb">
+    <w:name w:val="Normal (Web)"/>
+    <w:basedOn w:val="Normal"/>
+    <w:uiPriority w:val="99"/>
+    <w:semiHidden/>
+    <w:unhideWhenUsed/>
+    <w:rsid w:val="00E205CB"/>
+    <w:rPr>
+      <w:rFonts w:ascii="Times New Roman" w:hAnsi="Times New Roman" w:cs="Times New Roman"/>
     </w:rPr>
   </w:style>
 </w:styles>

</xml_diff>